<commit_message>
Chỉnh lại vài thứ
</commit_message>
<xml_diff>
--- a/Group5_Report_Stage2.docx
+++ b/Group5_Report_Stage2.docx
@@ -10310,15 +10310,16 @@
       </w:pPr>
       <w:r>
         <w:rPr>
-          <w:noProof/>
+          <w:b/>
+          <w:bCs/>
           <w:sz w:val="24"/>
           <w:szCs w:val="24"/>
         </w:rPr>
         <w:drawing>
-          <wp:inline distT="0" distB="0" distL="0" distR="0" wp14:anchorId="2BB9320C" wp14:editId="7AC1BEF6">
-            <wp:extent cx="5731510" cy="2084070"/>
+          <wp:inline distT="0" distB="0" distL="0" distR="0" wp14:anchorId="7FC74630" wp14:editId="2457FC27">
+            <wp:extent cx="5731510" cy="2364248"/>
             <wp:effectExtent l="0" t="0" r="2540" b="0"/>
-            <wp:docPr id="1809880087" name="Picture 1"/>
+            <wp:docPr id="5" name="Picture 5"/>
             <wp:cNvGraphicFramePr>
               <a:graphicFrameLocks xmlns:a="http://schemas.openxmlformats.org/drawingml/2006/main" noChangeAspect="1"/>
             </wp:cNvGraphicFramePr>
@@ -10326,7 +10327,7 @@
               <a:graphicData uri="http://schemas.openxmlformats.org/drawingml/2006/picture">
                 <pic:pic xmlns:pic="http://schemas.openxmlformats.org/drawingml/2006/picture">
                   <pic:nvPicPr>
-                    <pic:cNvPr id="1809880087" name=""/>
+                    <pic:cNvPr id="0" name=""/>
                     <pic:cNvPicPr/>
                   </pic:nvPicPr>
                   <pic:blipFill>
@@ -10338,7 +10339,7 @@
                   <pic:spPr>
                     <a:xfrm>
                       <a:off x="0" y="0"/>
-                      <a:ext cx="5731510" cy="2084070"/>
+                      <a:ext cx="5731510" cy="2364248"/>
                     </a:xfrm>
                     <a:prstGeom prst="rect">
                       <a:avLst/>
@@ -10392,15 +10393,13 @@
       <w:r>
         <w:rPr>
           <w:noProof/>
-          <w:sz w:val="24"/>
-          <w:szCs w:val="24"/>
         </w:rPr>
         <w:lastRenderedPageBreak/>
         <w:drawing>
-          <wp:inline distT="0" distB="0" distL="0" distR="0" wp14:anchorId="5F1079E7" wp14:editId="162179A6">
-            <wp:extent cx="5731510" cy="3165475"/>
+          <wp:inline distT="0" distB="0" distL="0" distR="0" wp14:anchorId="35FB2A65" wp14:editId="38D87EA5">
+            <wp:extent cx="5731510" cy="3223974"/>
             <wp:effectExtent l="0" t="0" r="2540" b="0"/>
-            <wp:docPr id="1719125563" name="Picture 1"/>
+            <wp:docPr id="6" name="Picture 6"/>
             <wp:cNvGraphicFramePr>
               <a:graphicFrameLocks xmlns:a="http://schemas.openxmlformats.org/drawingml/2006/main" noChangeAspect="1"/>
             </wp:cNvGraphicFramePr>
@@ -10408,7 +10407,7 @@
               <a:graphicData uri="http://schemas.openxmlformats.org/drawingml/2006/picture">
                 <pic:pic xmlns:pic="http://schemas.openxmlformats.org/drawingml/2006/picture">
                   <pic:nvPicPr>
-                    <pic:cNvPr id="1719125563" name=""/>
+                    <pic:cNvPr id="0" name=""/>
                     <pic:cNvPicPr/>
                   </pic:nvPicPr>
                   <pic:blipFill>
@@ -10420,7 +10419,7 @@
                   <pic:spPr>
                     <a:xfrm>
                       <a:off x="0" y="0"/>
-                      <a:ext cx="5731510" cy="3165475"/>
+                      <a:ext cx="5731510" cy="3223974"/>
                     </a:xfrm>
                     <a:prstGeom prst="rect">
                       <a:avLst/>
@@ -10453,18 +10452,13 @@
       </w:pPr>
       <w:r>
         <w:rPr>
-          <w:b/>
-          <w:bCs/>
           <w:noProof/>
-          <w:color w:val="auto"/>
-          <w:sz w:val="24"/>
-          <w:szCs w:val="24"/>
         </w:rPr>
         <w:drawing>
-          <wp:inline distT="0" distB="0" distL="0" distR="0" wp14:anchorId="38BD1084" wp14:editId="482F61C2">
-            <wp:extent cx="5731510" cy="2278380"/>
-            <wp:effectExtent l="0" t="0" r="2540" b="7620"/>
-            <wp:docPr id="1964447884" name="Picture 1"/>
+          <wp:inline distT="0" distB="0" distL="0" distR="0" wp14:anchorId="13616F9F" wp14:editId="7E17F465">
+            <wp:extent cx="5731510" cy="3223974"/>
+            <wp:effectExtent l="0" t="0" r="2540" b="0"/>
+            <wp:docPr id="7" name="Picture 7"/>
             <wp:cNvGraphicFramePr>
               <a:graphicFrameLocks xmlns:a="http://schemas.openxmlformats.org/drawingml/2006/main" noChangeAspect="1"/>
             </wp:cNvGraphicFramePr>
@@ -10472,7 +10466,7 @@
               <a:graphicData uri="http://schemas.openxmlformats.org/drawingml/2006/picture">
                 <pic:pic xmlns:pic="http://schemas.openxmlformats.org/drawingml/2006/picture">
                   <pic:nvPicPr>
-                    <pic:cNvPr id="1964447884" name=""/>
+                    <pic:cNvPr id="0" name=""/>
                     <pic:cNvPicPr/>
                   </pic:nvPicPr>
                   <pic:blipFill>
@@ -10484,7 +10478,7 @@
                   <pic:spPr>
                     <a:xfrm>
                       <a:off x="0" y="0"/>
-                      <a:ext cx="5731510" cy="2278380"/>
+                      <a:ext cx="5731510" cy="3223974"/>
                     </a:xfrm>
                     <a:prstGeom prst="rect">
                       <a:avLst/>
@@ -10496,6 +10490,8 @@
           </wp:inline>
         </w:drawing>
       </w:r>
+      <w:bookmarkStart w:id="0" w:name="_GoBack"/>
+      <w:bookmarkEnd w:id="0"/>
       <w:r>
         <w:rPr>
           <w:color w:val="auto"/>
@@ -10986,6 +10982,7 @@
           <w:sz w:val="24"/>
           <w:szCs w:val="24"/>
         </w:rPr>
+        <w:lastRenderedPageBreak/>
         <w:t>Khi tăng số lượng, cả tổng tiền và xác suất đơn giá trị cao đều tăng rõ rệt. Điều này hợp lý và khớp với dữ liệu thật (xem phần 3.4).</w:t>
       </w:r>
     </w:p>
@@ -11111,7 +11108,6 @@
                 <w:sz w:val="24"/>
                 <w:szCs w:val="24"/>
               </w:rPr>
-              <w:lastRenderedPageBreak/>
               <w:t>Số lượng/đơn</w:t>
             </w:r>
           </w:p>
@@ -12826,12 +12822,11 @@
           <w:color w:val="auto"/>
         </w:rPr>
       </w:pPr>
-      <w:bookmarkStart w:id="0" w:name="_GoBack"/>
-      <w:bookmarkEnd w:id="0"/>
       <w:r>
         <w:rPr>
           <w:color w:val="auto"/>
         </w:rPr>
+        <w:lastRenderedPageBreak/>
         <w:t>Khuyến nghị 3: Ưu tiên theo nhóm sản phẩm – đẩy mạnh nhóm doanh thu cao, tạo combo cho nhóm bán nhiều nhưng giá thấp</w:t>
       </w:r>
     </w:p>
@@ -13392,7 +13387,6 @@
                 <w:sz w:val="24"/>
                 <w:szCs w:val="24"/>
               </w:rPr>
-              <w:lastRenderedPageBreak/>
               <w:t>Băng vệ sinh</w:t>
             </w:r>
           </w:p>

</xml_diff>

<commit_message>
Chạy lại cho chắc
</commit_message>
<xml_diff>
--- a/Group5_Report_Stage2.docx
+++ b/Group5_Report_Stage2.docx
@@ -13,7 +13,7 @@
         <w:rPr>
           <w:color w:val="auto"/>
         </w:rPr>
-        <w:t>Nhóm 5: Stage 1- Data Preprocessing &amp; Exploratory Data Analysis (EDA)</w:t>
+        <w:t>Nhóm 5: Stage 2- Data Preprocessing &amp; Exploratory Data Analysis (EDA)</w:t>
       </w:r>
     </w:p>
     <w:p>
@@ -637,7 +637,6 @@
         <w:r>
           <w:rPr>
             <w:rStyle w:val="Hyperlink"/>
-            <w:color w:val="auto"/>
             <w:sz w:val="24"/>
             <w:szCs w:val="24"/>
           </w:rPr>
@@ -726,21 +725,7 @@
           <w:sz w:val="24"/>
           <w:szCs w:val="24"/>
         </w:rPr>
-        <w:t xml:space="preserve"> để chia khách hàng thành các nhóm có đặc đi</w:t>
-      </w:r>
-      <w:r>
-        <w:rPr>
-          <w:sz w:val="24"/>
-          <w:szCs w:val="24"/>
-        </w:rPr>
-        <w:t>ểm mua sắm giống nhau. Cuối cùng</w:t>
-      </w:r>
-      <w:r>
-        <w:rPr>
-          <w:sz w:val="24"/>
-          <w:szCs w:val="24"/>
-        </w:rPr>
-        <w:t xml:space="preserve"> so sánh kết quả phân cụm khi </w:t>
+        <w:t xml:space="preserve"> để chia khách hàng thành các nhóm có đặc điểm mua sắm giống nhau. Cuối cùng so sánh kết quả phân cụm khi </w:t>
       </w:r>
       <w:r>
         <w:rPr>
@@ -853,7 +838,7 @@
           <w:left w:w="10" w:type="dxa"/>
           <w:right w:w="10" w:type="dxa"/>
         </w:tblCellMar>
-        <w:tblLook w:val="0000" w:firstRow="0" w:lastRow="0" w:firstColumn="0" w:lastColumn="0" w:noHBand="0" w:noVBand="0"/>
+        <w:tblLook w:val="04A0" w:firstRow="1" w:lastRow="0" w:firstColumn="1" w:lastColumn="0" w:noHBand="0" w:noVBand="1"/>
       </w:tblPr>
       <w:tblGrid>
         <w:gridCol w:w="2600"/>
@@ -879,6 +864,7 @@
               <w:bottom w:w="60" w:type="dxa"/>
               <w:right w:w="90" w:type="dxa"/>
             </w:tcMar>
+            <w:hideMark/>
           </w:tcPr>
           <w:p>
             <w:pPr>
@@ -915,6 +901,7 @@
               <w:bottom w:w="60" w:type="dxa"/>
               <w:right w:w="90" w:type="dxa"/>
             </w:tcMar>
+            <w:hideMark/>
           </w:tcPr>
           <w:p>
             <w:pPr>
@@ -952,6 +939,7 @@
               <w:bottom w:w="60" w:type="dxa"/>
               <w:right w:w="90" w:type="dxa"/>
             </w:tcMar>
+            <w:hideMark/>
           </w:tcPr>
           <w:p>
             <w:pPr>
@@ -984,6 +972,7 @@
               <w:bottom w:w="60" w:type="dxa"/>
               <w:right w:w="90" w:type="dxa"/>
             </w:tcMar>
+            <w:hideMark/>
           </w:tcPr>
           <w:p>
             <w:pPr>
@@ -1019,6 +1008,7 @@
               <w:bottom w:w="60" w:type="dxa"/>
               <w:right w:w="90" w:type="dxa"/>
             </w:tcMar>
+            <w:hideMark/>
           </w:tcPr>
           <w:p>
             <w:pPr>
@@ -1051,6 +1041,7 @@
               <w:bottom w:w="60" w:type="dxa"/>
               <w:right w:w="90" w:type="dxa"/>
             </w:tcMar>
+            <w:hideMark/>
           </w:tcPr>
           <w:p>
             <w:pPr>
@@ -1086,6 +1077,7 @@
               <w:bottom w:w="60" w:type="dxa"/>
               <w:right w:w="90" w:type="dxa"/>
             </w:tcMar>
+            <w:hideMark/>
           </w:tcPr>
           <w:p>
             <w:pPr>
@@ -1118,6 +1110,7 @@
               <w:bottom w:w="60" w:type="dxa"/>
               <w:right w:w="90" w:type="dxa"/>
             </w:tcMar>
+            <w:hideMark/>
           </w:tcPr>
           <w:p>
             <w:pPr>
@@ -1153,6 +1146,7 @@
               <w:bottom w:w="60" w:type="dxa"/>
               <w:right w:w="90" w:type="dxa"/>
             </w:tcMar>
+            <w:hideMark/>
           </w:tcPr>
           <w:p>
             <w:pPr>
@@ -1185,6 +1179,7 @@
               <w:bottom w:w="60" w:type="dxa"/>
               <w:right w:w="90" w:type="dxa"/>
             </w:tcMar>
+            <w:hideMark/>
           </w:tcPr>
           <w:p>
             <w:pPr>
@@ -1220,6 +1215,7 @@
               <w:bottom w:w="60" w:type="dxa"/>
               <w:right w:w="90" w:type="dxa"/>
             </w:tcMar>
+            <w:hideMark/>
           </w:tcPr>
           <w:p>
             <w:pPr>
@@ -1252,6 +1248,7 @@
               <w:bottom w:w="60" w:type="dxa"/>
               <w:right w:w="90" w:type="dxa"/>
             </w:tcMar>
+            <w:hideMark/>
           </w:tcPr>
           <w:p>
             <w:pPr>
@@ -1287,6 +1284,7 @@
               <w:bottom w:w="60" w:type="dxa"/>
               <w:right w:w="90" w:type="dxa"/>
             </w:tcMar>
+            <w:hideMark/>
           </w:tcPr>
           <w:p>
             <w:pPr>
@@ -1319,6 +1317,7 @@
               <w:bottom w:w="60" w:type="dxa"/>
               <w:right w:w="90" w:type="dxa"/>
             </w:tcMar>
+            <w:hideMark/>
           </w:tcPr>
           <w:p>
             <w:pPr>
@@ -1488,7 +1487,7 @@
           <w:left w:w="10" w:type="dxa"/>
           <w:right w:w="10" w:type="dxa"/>
         </w:tblCellMar>
-        <w:tblLook w:val="0000" w:firstRow="0" w:lastRow="0" w:firstColumn="0" w:lastColumn="0" w:noHBand="0" w:noVBand="0"/>
+        <w:tblLook w:val="04A0" w:firstRow="1" w:lastRow="0" w:firstColumn="1" w:lastColumn="0" w:noHBand="0" w:noVBand="1"/>
       </w:tblPr>
       <w:tblGrid>
         <w:gridCol w:w="2340"/>
@@ -1515,6 +1514,7 @@
               <w:bottom w:w="60" w:type="dxa"/>
               <w:right w:w="90" w:type="dxa"/>
             </w:tcMar>
+            <w:hideMark/>
           </w:tcPr>
           <w:p>
             <w:pPr>
@@ -1551,6 +1551,7 @@
               <w:bottom w:w="60" w:type="dxa"/>
               <w:right w:w="90" w:type="dxa"/>
             </w:tcMar>
+            <w:hideMark/>
           </w:tcPr>
           <w:p>
             <w:pPr>
@@ -1587,6 +1588,7 @@
               <w:bottom w:w="60" w:type="dxa"/>
               <w:right w:w="90" w:type="dxa"/>
             </w:tcMar>
+            <w:hideMark/>
           </w:tcPr>
           <w:p>
             <w:pPr>
@@ -1624,6 +1626,7 @@
               <w:bottom w:w="60" w:type="dxa"/>
               <w:right w:w="90" w:type="dxa"/>
             </w:tcMar>
+            <w:hideMark/>
           </w:tcPr>
           <w:p>
             <w:pPr>
@@ -1658,6 +1661,7 @@
               <w:bottom w:w="60" w:type="dxa"/>
               <w:right w:w="90" w:type="dxa"/>
             </w:tcMar>
+            <w:hideMark/>
           </w:tcPr>
           <w:p>
             <w:pPr>
@@ -1691,6 +1695,7 @@
               <w:bottom w:w="60" w:type="dxa"/>
               <w:right w:w="90" w:type="dxa"/>
             </w:tcMar>
+            <w:hideMark/>
           </w:tcPr>
           <w:p>
             <w:pPr>
@@ -1726,6 +1731,7 @@
               <w:bottom w:w="60" w:type="dxa"/>
               <w:right w:w="90" w:type="dxa"/>
             </w:tcMar>
+            <w:hideMark/>
           </w:tcPr>
           <w:p>
             <w:pPr>
@@ -1760,6 +1766,7 @@
               <w:bottom w:w="60" w:type="dxa"/>
               <w:right w:w="90" w:type="dxa"/>
             </w:tcMar>
+            <w:hideMark/>
           </w:tcPr>
           <w:p>
             <w:pPr>
@@ -1793,6 +1800,7 @@
               <w:bottom w:w="60" w:type="dxa"/>
               <w:right w:w="90" w:type="dxa"/>
             </w:tcMar>
+            <w:hideMark/>
           </w:tcPr>
           <w:p>
             <w:pPr>
@@ -1828,6 +1836,7 @@
               <w:bottom w:w="60" w:type="dxa"/>
               <w:right w:w="90" w:type="dxa"/>
             </w:tcMar>
+            <w:hideMark/>
           </w:tcPr>
           <w:p>
             <w:pPr>
@@ -1862,6 +1871,7 @@
               <w:bottom w:w="60" w:type="dxa"/>
               <w:right w:w="90" w:type="dxa"/>
             </w:tcMar>
+            <w:hideMark/>
           </w:tcPr>
           <w:p>
             <w:pPr>
@@ -1895,6 +1905,7 @@
               <w:bottom w:w="60" w:type="dxa"/>
               <w:right w:w="90" w:type="dxa"/>
             </w:tcMar>
+            <w:hideMark/>
           </w:tcPr>
           <w:p>
             <w:pPr>
@@ -1930,6 +1941,7 @@
               <w:bottom w:w="60" w:type="dxa"/>
               <w:right w:w="90" w:type="dxa"/>
             </w:tcMar>
+            <w:hideMark/>
           </w:tcPr>
           <w:p>
             <w:pPr>
@@ -1964,6 +1976,7 @@
               <w:bottom w:w="60" w:type="dxa"/>
               <w:right w:w="90" w:type="dxa"/>
             </w:tcMar>
+            <w:hideMark/>
           </w:tcPr>
           <w:p>
             <w:pPr>
@@ -1997,6 +2010,7 @@
               <w:bottom w:w="60" w:type="dxa"/>
               <w:right w:w="90" w:type="dxa"/>
             </w:tcMar>
+            <w:hideMark/>
           </w:tcPr>
           <w:p>
             <w:pPr>
@@ -2032,6 +2046,7 @@
               <w:bottom w:w="60" w:type="dxa"/>
               <w:right w:w="90" w:type="dxa"/>
             </w:tcMar>
+            <w:hideMark/>
           </w:tcPr>
           <w:p>
             <w:pPr>
@@ -2066,6 +2081,7 @@
               <w:bottom w:w="60" w:type="dxa"/>
               <w:right w:w="90" w:type="dxa"/>
             </w:tcMar>
+            <w:hideMark/>
           </w:tcPr>
           <w:p>
             <w:pPr>
@@ -2099,6 +2115,7 @@
               <w:bottom w:w="60" w:type="dxa"/>
               <w:right w:w="90" w:type="dxa"/>
             </w:tcMar>
+            <w:hideMark/>
           </w:tcPr>
           <w:p>
             <w:pPr>
@@ -2134,6 +2151,7 @@
               <w:bottom w:w="60" w:type="dxa"/>
               <w:right w:w="90" w:type="dxa"/>
             </w:tcMar>
+            <w:hideMark/>
           </w:tcPr>
           <w:p>
             <w:pPr>
@@ -2168,6 +2186,7 @@
               <w:bottom w:w="60" w:type="dxa"/>
               <w:right w:w="90" w:type="dxa"/>
             </w:tcMar>
+            <w:hideMark/>
           </w:tcPr>
           <w:p>
             <w:pPr>
@@ -2201,6 +2220,7 @@
               <w:bottom w:w="60" w:type="dxa"/>
               <w:right w:w="90" w:type="dxa"/>
             </w:tcMar>
+            <w:hideMark/>
           </w:tcPr>
           <w:p>
             <w:pPr>
@@ -2238,10 +2258,10 @@
           <w:szCs w:val="24"/>
         </w:rPr>
         <w:drawing>
-          <wp:inline distT="0" distB="0" distL="0" distR="0" wp14:anchorId="3CEA391E" wp14:editId="009E18AE">
-            <wp:extent cx="4953000" cy="2686050"/>
-            <wp:effectExtent l="0" t="0" r="0" b="0"/>
-            <wp:docPr id="1" name="Hình 1. Biểu đồ phương sai tích lũy (Cumulative Explained Variance)" descr="Hình 1. Biểu đồ phương sai tích lũy (Cumulative Explained Variance)" title="Hình 1. Biểu đồ phương sai tích lũy (Cumulative Explained Variance)"/>
+          <wp:inline distT="0" distB="0" distL="0" distR="0">
+            <wp:extent cx="4951730" cy="2682875"/>
+            <wp:effectExtent l="0" t="0" r="1270" b="3175"/>
+            <wp:docPr id="15" name="Picture 15" descr="Title: Hình 1. Biểu đồ phương sai tích lũy (Cumulative Explained Variance) - Description: Hình 1. Biểu đồ phương sai tích lũy (Cumulative Explained Variance)"/>
             <wp:cNvGraphicFramePr>
               <a:graphicFrameLocks xmlns:a="http://schemas.openxmlformats.org/drawingml/2006/main" noChangeAspect="1"/>
             </wp:cNvGraphicFramePr>
@@ -2249,13 +2269,19 @@
               <a:graphicData uri="http://schemas.openxmlformats.org/drawingml/2006/picture">
                 <pic:pic xmlns:pic="http://schemas.openxmlformats.org/drawingml/2006/picture">
                   <pic:nvPicPr>
-                    <pic:cNvPr id="0" name=""/>
+                    <pic:cNvPr id="0" name="Hình 1. Biểu đồ phương sai tích lũy (Cumulative Explained Variance)" descr="Title: Hình 1. Biểu đồ phương sai tích lũy (Cumulative Explained Variance) - Description: Hình 1. Biểu đồ phương sai tích lũy (Cumulative Explained Variance)"/>
                     <pic:cNvPicPr>
                       <a:picLocks noChangeAspect="1" noChangeArrowheads="1"/>
                     </pic:cNvPicPr>
                   </pic:nvPicPr>
                   <pic:blipFill>
-                    <a:blip r:embed="rId7"/>
+                    <a:blip r:embed="rId7">
+                      <a:extLst>
+                        <a:ext uri="{28A0092B-C50C-407E-A947-70E740481C1C}">
+                          <a14:useLocalDpi xmlns:a14="http://schemas.microsoft.com/office/drawing/2010/main" val="0"/>
+                        </a:ext>
+                      </a:extLst>
+                    </a:blip>
                     <a:srcRect/>
                     <a:stretch>
                       <a:fillRect/>
@@ -2264,11 +2290,15 @@
                   <pic:spPr bwMode="auto">
                     <a:xfrm>
                       <a:off x="0" y="0"/>
-                      <a:ext cx="4953000" cy="2686050"/>
+                      <a:ext cx="4951730" cy="2682875"/>
                     </a:xfrm>
                     <a:prstGeom prst="rect">
                       <a:avLst/>
                     </a:prstGeom>
+                    <a:noFill/>
+                    <a:ln>
+                      <a:noFill/>
+                    </a:ln>
                   </pic:spPr>
                 </pic:pic>
               </a:graphicData>
@@ -2386,7 +2416,7 @@
         <w:pStyle w:val="ListParagraph"/>
         <w:numPr>
           <w:ilvl w:val="0"/>
-          <w:numId w:val="2"/>
+          <w:numId w:val="8"/>
         </w:numPr>
         <w:spacing w:after="80" w:line="300" w:lineRule="auto"/>
         <w:rPr>
@@ -2432,7 +2462,7 @@
         <w:pStyle w:val="ListParagraph"/>
         <w:numPr>
           <w:ilvl w:val="0"/>
-          <w:numId w:val="2"/>
+          <w:numId w:val="8"/>
         </w:numPr>
         <w:spacing w:after="80" w:line="300" w:lineRule="auto"/>
         <w:rPr>
@@ -2478,7 +2508,7 @@
         <w:pStyle w:val="ListParagraph"/>
         <w:numPr>
           <w:ilvl w:val="0"/>
-          <w:numId w:val="2"/>
+          <w:numId w:val="8"/>
         </w:numPr>
         <w:spacing w:after="80" w:line="300" w:lineRule="auto"/>
         <w:rPr>
@@ -2524,7 +2554,7 @@
         <w:pStyle w:val="ListParagraph"/>
         <w:numPr>
           <w:ilvl w:val="0"/>
-          <w:numId w:val="2"/>
+          <w:numId w:val="8"/>
         </w:numPr>
         <w:spacing w:after="80" w:line="300" w:lineRule="auto"/>
         <w:rPr>
@@ -2583,10 +2613,10 @@
           <w:szCs w:val="24"/>
         </w:rPr>
         <w:drawing>
-          <wp:inline distT="0" distB="0" distL="0" distR="0" wp14:anchorId="16C5992A" wp14:editId="35918D71">
-            <wp:extent cx="4095750" cy="3000375"/>
-            <wp:effectExtent l="0" t="0" r="0" b="0"/>
-            <wp:docPr id="2" name="Hình 2. Dữ liệu khách hàng chiếu lên mặt phẳng PC1–PC2" descr="Hình 2. Dữ liệu khách hàng chiếu lên mặt phẳng PC1–PC2" title="Hình 2. Dữ liệu khách hàng chiếu lên mặt phẳng PC1–PC2"/>
+          <wp:inline distT="0" distB="0" distL="0" distR="0">
+            <wp:extent cx="4097655" cy="3002280"/>
+            <wp:effectExtent l="0" t="0" r="0" b="7620"/>
+            <wp:docPr id="14" name="Picture 14" descr="Title: Hình 2. Dữ liệu khách hàng chiếu lên mặt phẳng PC1–PC2 - Description: Hình 2. Dữ liệu khách hàng chiếu lên mặt phẳng PC1–PC2"/>
             <wp:cNvGraphicFramePr>
               <a:graphicFrameLocks xmlns:a="http://schemas.openxmlformats.org/drawingml/2006/main" noChangeAspect="1"/>
             </wp:cNvGraphicFramePr>
@@ -2594,14 +2624,20 @@
               <a:graphicData uri="http://schemas.openxmlformats.org/drawingml/2006/picture">
                 <pic:pic xmlns:pic="http://schemas.openxmlformats.org/drawingml/2006/picture">
                   <pic:nvPicPr>
-                    <pic:cNvPr id="0" name=""/>
+                    <pic:cNvPr id="0" name="Hình 2. Dữ liệu khách hàng chiếu lên mặt phẳng PC1–PC2" descr="Title: Hình 2. Dữ liệu khách hàng chiếu lên mặt phẳng PC1–PC2 - Description: Hình 2. Dữ liệu khách hàng chiếu lên mặt phẳng PC1–PC2"/>
                     <pic:cNvPicPr>
                       <a:picLocks noChangeAspect="1" noChangeArrowheads="1"/>
                     </pic:cNvPicPr>
                   </pic:nvPicPr>
                   <pic:blipFill>
-                    <a:blip r:embed="rId8"/>
-                    <a:srcRect/>
+                    <a:blip r:embed="rId8">
+                      <a:extLst>
+                        <a:ext uri="{28A0092B-C50C-407E-A947-70E740481C1C}">
+                          <a14:useLocalDpi xmlns:a14="http://schemas.microsoft.com/office/drawing/2010/main" val="0"/>
+                        </a:ext>
+                      </a:extLst>
+                    </a:blip>
+                    <a:srcRect b="-43"/>
                     <a:stretch>
                       <a:fillRect/>
                     </a:stretch>
@@ -2609,11 +2645,15 @@
                   <pic:spPr bwMode="auto">
                     <a:xfrm>
                       <a:off x="0" y="0"/>
-                      <a:ext cx="4095750" cy="3000375"/>
+                      <a:ext cx="4097655" cy="3002280"/>
                     </a:xfrm>
                     <a:prstGeom prst="rect">
                       <a:avLst/>
                     </a:prstGeom>
+                    <a:noFill/>
+                    <a:ln>
+                      <a:noFill/>
+                    </a:ln>
                   </pic:spPr>
                 </pic:pic>
               </a:graphicData>
@@ -2760,7 +2800,7 @@
           <w:left w:w="10" w:type="dxa"/>
           <w:right w:w="10" w:type="dxa"/>
         </w:tblCellMar>
-        <w:tblLook w:val="0000" w:firstRow="0" w:lastRow="0" w:firstColumn="0" w:lastColumn="0" w:noHBand="0" w:noVBand="0"/>
+        <w:tblLook w:val="04A0" w:firstRow="1" w:lastRow="0" w:firstColumn="1" w:lastColumn="0" w:noHBand="0" w:noVBand="1"/>
       </w:tblPr>
       <w:tblGrid>
         <w:gridCol w:w="1260"/>
@@ -2794,6 +2834,7 @@
               <w:bottom w:w="60" w:type="dxa"/>
               <w:right w:w="90" w:type="dxa"/>
             </w:tcMar>
+            <w:hideMark/>
           </w:tcPr>
           <w:p>
             <w:pPr>
@@ -2830,6 +2871,7 @@
               <w:bottom w:w="60" w:type="dxa"/>
               <w:right w:w="90" w:type="dxa"/>
             </w:tcMar>
+            <w:hideMark/>
           </w:tcPr>
           <w:p>
             <w:pPr>
@@ -2866,6 +2908,7 @@
               <w:bottom w:w="60" w:type="dxa"/>
               <w:right w:w="90" w:type="dxa"/>
             </w:tcMar>
+            <w:hideMark/>
           </w:tcPr>
           <w:p>
             <w:pPr>
@@ -2902,6 +2945,7 @@
               <w:bottom w:w="60" w:type="dxa"/>
               <w:right w:w="90" w:type="dxa"/>
             </w:tcMar>
+            <w:hideMark/>
           </w:tcPr>
           <w:p>
             <w:pPr>
@@ -2938,6 +2982,7 @@
               <w:bottom w:w="60" w:type="dxa"/>
               <w:right w:w="90" w:type="dxa"/>
             </w:tcMar>
+            <w:hideMark/>
           </w:tcPr>
           <w:p>
             <w:pPr>
@@ -2974,6 +3019,7 @@
               <w:bottom w:w="60" w:type="dxa"/>
               <w:right w:w="90" w:type="dxa"/>
             </w:tcMar>
+            <w:hideMark/>
           </w:tcPr>
           <w:p>
             <w:pPr>
@@ -3010,6 +3056,7 @@
               <w:bottom w:w="60" w:type="dxa"/>
               <w:right w:w="90" w:type="dxa"/>
             </w:tcMar>
+            <w:hideMark/>
           </w:tcPr>
           <w:p>
             <w:pPr>
@@ -3046,6 +3093,7 @@
               <w:bottom w:w="60" w:type="dxa"/>
               <w:right w:w="90" w:type="dxa"/>
             </w:tcMar>
+            <w:hideMark/>
           </w:tcPr>
           <w:p>
             <w:pPr>
@@ -3082,6 +3130,7 @@
               <w:bottom w:w="60" w:type="dxa"/>
               <w:right w:w="90" w:type="dxa"/>
             </w:tcMar>
+            <w:hideMark/>
           </w:tcPr>
           <w:p>
             <w:pPr>
@@ -3118,6 +3167,7 @@
               <w:bottom w:w="60" w:type="dxa"/>
               <w:right w:w="90" w:type="dxa"/>
             </w:tcMar>
+            <w:hideMark/>
           </w:tcPr>
           <w:p>
             <w:pPr>
@@ -3155,6 +3205,7 @@
               <w:bottom w:w="60" w:type="dxa"/>
               <w:right w:w="90" w:type="dxa"/>
             </w:tcMar>
+            <w:hideMark/>
           </w:tcPr>
           <w:p>
             <w:pPr>
@@ -3189,6 +3240,7 @@
               <w:bottom w:w="60" w:type="dxa"/>
               <w:right w:w="90" w:type="dxa"/>
             </w:tcMar>
+            <w:hideMark/>
           </w:tcPr>
           <w:p>
             <w:pPr>
@@ -3222,6 +3274,7 @@
               <w:bottom w:w="60" w:type="dxa"/>
               <w:right w:w="90" w:type="dxa"/>
             </w:tcMar>
+            <w:hideMark/>
           </w:tcPr>
           <w:p>
             <w:pPr>
@@ -3255,6 +3308,7 @@
               <w:bottom w:w="60" w:type="dxa"/>
               <w:right w:w="90" w:type="dxa"/>
             </w:tcMar>
+            <w:hideMark/>
           </w:tcPr>
           <w:p>
             <w:pPr>
@@ -3288,6 +3342,7 @@
               <w:bottom w:w="60" w:type="dxa"/>
               <w:right w:w="90" w:type="dxa"/>
             </w:tcMar>
+            <w:hideMark/>
           </w:tcPr>
           <w:p>
             <w:pPr>
@@ -3321,6 +3376,7 @@
               <w:bottom w:w="60" w:type="dxa"/>
               <w:right w:w="90" w:type="dxa"/>
             </w:tcMar>
+            <w:hideMark/>
           </w:tcPr>
           <w:p>
             <w:pPr>
@@ -3354,6 +3410,7 @@
               <w:bottom w:w="60" w:type="dxa"/>
               <w:right w:w="90" w:type="dxa"/>
             </w:tcMar>
+            <w:hideMark/>
           </w:tcPr>
           <w:p>
             <w:pPr>
@@ -3387,6 +3444,7 @@
               <w:bottom w:w="60" w:type="dxa"/>
               <w:right w:w="90" w:type="dxa"/>
             </w:tcMar>
+            <w:hideMark/>
           </w:tcPr>
           <w:p>
             <w:pPr>
@@ -3420,6 +3478,7 @@
               <w:bottom w:w="60" w:type="dxa"/>
               <w:right w:w="90" w:type="dxa"/>
             </w:tcMar>
+            <w:hideMark/>
           </w:tcPr>
           <w:p>
             <w:pPr>
@@ -3453,6 +3512,7 @@
               <w:bottom w:w="60" w:type="dxa"/>
               <w:right w:w="90" w:type="dxa"/>
             </w:tcMar>
+            <w:hideMark/>
           </w:tcPr>
           <w:p>
             <w:pPr>
@@ -3488,6 +3548,7 @@
               <w:bottom w:w="60" w:type="dxa"/>
               <w:right w:w="90" w:type="dxa"/>
             </w:tcMar>
+            <w:hideMark/>
           </w:tcPr>
           <w:p>
             <w:pPr>
@@ -3522,6 +3583,7 @@
               <w:bottom w:w="60" w:type="dxa"/>
               <w:right w:w="90" w:type="dxa"/>
             </w:tcMar>
+            <w:hideMark/>
           </w:tcPr>
           <w:p>
             <w:pPr>
@@ -3555,6 +3617,7 @@
               <w:bottom w:w="60" w:type="dxa"/>
               <w:right w:w="90" w:type="dxa"/>
             </w:tcMar>
+            <w:hideMark/>
           </w:tcPr>
           <w:p>
             <w:pPr>
@@ -3588,6 +3651,7 @@
               <w:bottom w:w="60" w:type="dxa"/>
               <w:right w:w="90" w:type="dxa"/>
             </w:tcMar>
+            <w:hideMark/>
           </w:tcPr>
           <w:p>
             <w:pPr>
@@ -3621,6 +3685,7 @@
               <w:bottom w:w="60" w:type="dxa"/>
               <w:right w:w="90" w:type="dxa"/>
             </w:tcMar>
+            <w:hideMark/>
           </w:tcPr>
           <w:p>
             <w:pPr>
@@ -3654,6 +3719,7 @@
               <w:bottom w:w="60" w:type="dxa"/>
               <w:right w:w="90" w:type="dxa"/>
             </w:tcMar>
+            <w:hideMark/>
           </w:tcPr>
           <w:p>
             <w:pPr>
@@ -3687,6 +3753,7 @@
               <w:bottom w:w="60" w:type="dxa"/>
               <w:right w:w="90" w:type="dxa"/>
             </w:tcMar>
+            <w:hideMark/>
           </w:tcPr>
           <w:p>
             <w:pPr>
@@ -3720,6 +3787,7 @@
               <w:bottom w:w="60" w:type="dxa"/>
               <w:right w:w="90" w:type="dxa"/>
             </w:tcMar>
+            <w:hideMark/>
           </w:tcPr>
           <w:p>
             <w:pPr>
@@ -3753,6 +3821,7 @@
               <w:bottom w:w="60" w:type="dxa"/>
               <w:right w:w="90" w:type="dxa"/>
             </w:tcMar>
+            <w:hideMark/>
           </w:tcPr>
           <w:p>
             <w:pPr>
@@ -3786,6 +3855,7 @@
               <w:bottom w:w="60" w:type="dxa"/>
               <w:right w:w="90" w:type="dxa"/>
             </w:tcMar>
+            <w:hideMark/>
           </w:tcPr>
           <w:p>
             <w:pPr>
@@ -3823,10 +3893,10 @@
           <w:szCs w:val="24"/>
         </w:rPr>
         <w:drawing>
-          <wp:inline distT="0" distB="0" distL="0" distR="0" wp14:anchorId="283AF4D7" wp14:editId="78CFB711">
-            <wp:extent cx="5715000" cy="2171700"/>
+          <wp:inline distT="0" distB="0" distL="0" distR="0">
+            <wp:extent cx="5719445" cy="2173605"/>
             <wp:effectExtent l="0" t="0" r="0" b="0"/>
-            <wp:docPr id="3" name="Hình 3. Biểu đồ Elbow (WCSS) và Silhouette Score theo K" descr="Hình 3. Biểu đồ Elbow (WCSS) và Silhouette Score theo K" title="Hình 3. Biểu đồ Elbow (WCSS) và Silhouette Score theo K"/>
+            <wp:docPr id="13" name="Picture 13" descr="Title: Hình 3. Biểu đồ Elbow (WCSS) và Silhouette Score theo K - Description: Hình 3. Biểu đồ Elbow (WCSS) và Silhouette Score theo K"/>
             <wp:cNvGraphicFramePr>
               <a:graphicFrameLocks xmlns:a="http://schemas.openxmlformats.org/drawingml/2006/main" noChangeAspect="1"/>
             </wp:cNvGraphicFramePr>
@@ -3834,14 +3904,20 @@
               <a:graphicData uri="http://schemas.openxmlformats.org/drawingml/2006/picture">
                 <pic:pic xmlns:pic="http://schemas.openxmlformats.org/drawingml/2006/picture">
                   <pic:nvPicPr>
-                    <pic:cNvPr id="0" name=""/>
+                    <pic:cNvPr id="0" name="Hình 3. Biểu đồ Elbow (WCSS) và Silhouette Score theo K" descr="Title: Hình 3. Biểu đồ Elbow (WCSS) và Silhouette Score theo K - Description: Hình 3. Biểu đồ Elbow (WCSS) và Silhouette Score theo K"/>
                     <pic:cNvPicPr>
                       <a:picLocks noChangeAspect="1" noChangeArrowheads="1"/>
                     </pic:cNvPicPr>
                   </pic:nvPicPr>
                   <pic:blipFill>
-                    <a:blip r:embed="rId9"/>
-                    <a:srcRect/>
+                    <a:blip r:embed="rId9">
+                      <a:extLst>
+                        <a:ext uri="{28A0092B-C50C-407E-A947-70E740481C1C}">
+                          <a14:useLocalDpi xmlns:a14="http://schemas.microsoft.com/office/drawing/2010/main" val="0"/>
+                        </a:ext>
+                      </a:extLst>
+                    </a:blip>
+                    <a:srcRect b="-60"/>
                     <a:stretch>
                       <a:fillRect/>
                     </a:stretch>
@@ -3849,11 +3925,15 @@
                   <pic:spPr bwMode="auto">
                     <a:xfrm>
                       <a:off x="0" y="0"/>
-                      <a:ext cx="5715000" cy="2171700"/>
+                      <a:ext cx="5719445" cy="2173605"/>
                     </a:xfrm>
                     <a:prstGeom prst="rect">
                       <a:avLst/>
                     </a:prstGeom>
+                    <a:noFill/>
+                    <a:ln>
+                      <a:noFill/>
+                    </a:ln>
                   </pic:spPr>
                 </pic:pic>
               </a:graphicData>
@@ -3903,7 +3983,7 @@
         <w:pStyle w:val="ListParagraph"/>
         <w:numPr>
           <w:ilvl w:val="0"/>
-          <w:numId w:val="2"/>
+          <w:numId w:val="8"/>
         </w:numPr>
         <w:spacing w:after="80" w:line="300" w:lineRule="auto"/>
         <w:rPr>
@@ -3950,7 +4030,7 @@
         <w:pStyle w:val="ListParagraph"/>
         <w:numPr>
           <w:ilvl w:val="0"/>
-          <w:numId w:val="2"/>
+          <w:numId w:val="8"/>
         </w:numPr>
         <w:spacing w:after="80" w:line="300" w:lineRule="auto"/>
         <w:rPr>
@@ -4083,7 +4163,7 @@
         <w:pStyle w:val="ListParagraph"/>
         <w:numPr>
           <w:ilvl w:val="0"/>
-          <w:numId w:val="2"/>
+          <w:numId w:val="8"/>
         </w:numPr>
         <w:spacing w:after="80" w:line="300" w:lineRule="auto"/>
         <w:rPr>
@@ -4113,7 +4193,7 @@
         <w:pStyle w:val="ListParagraph"/>
         <w:numPr>
           <w:ilvl w:val="0"/>
-          <w:numId w:val="2"/>
+          <w:numId w:val="8"/>
         </w:numPr>
         <w:spacing w:after="80" w:line="300" w:lineRule="auto"/>
         <w:rPr>
@@ -4155,10 +4235,10 @@
           <w:szCs w:val="24"/>
         </w:rPr>
         <w:drawing>
-          <wp:inline distT="0" distB="0" distL="0" distR="0" wp14:anchorId="5A1DCBDC" wp14:editId="44228E70">
-            <wp:extent cx="4286250" cy="3038475"/>
+          <wp:inline distT="0" distB="0" distL="0" distR="0">
+            <wp:extent cx="4287520" cy="3036570"/>
             <wp:effectExtent l="0" t="0" r="0" b="0"/>
-            <wp:docPr id="4" name="Hình 4. Kết quả K-Means (K = 2) trên mặt phẳng PC1–PC2" descr="Hình 4. Kết quả K-Means (K = 2) trên mặt phẳng PC1–PC2" title="Hình 4. Kết quả K-Means (K = 2) trên mặt phẳng PC1–PC2"/>
+            <wp:docPr id="12" name="Picture 12" descr="Title: Hình 4. Kết quả K-Means (K = 2) trên mặt phẳng PC1–PC2 - Description: Hình 4. Kết quả K-Means (K = 2) trên mặt phẳng PC1–PC2"/>
             <wp:cNvGraphicFramePr>
               <a:graphicFrameLocks xmlns:a="http://schemas.openxmlformats.org/drawingml/2006/main" noChangeAspect="1"/>
             </wp:cNvGraphicFramePr>
@@ -4166,14 +4246,20 @@
               <a:graphicData uri="http://schemas.openxmlformats.org/drawingml/2006/picture">
                 <pic:pic xmlns:pic="http://schemas.openxmlformats.org/drawingml/2006/picture">
                   <pic:nvPicPr>
-                    <pic:cNvPr id="0" name=""/>
+                    <pic:cNvPr id="0" name="Hình 4. Kết quả K-Means (K = 2) trên mặt phẳng PC1–PC2" descr="Title: Hình 4. Kết quả K-Means (K = 2) trên mặt phẳng PC1–PC2 - Description: Hình 4. Kết quả K-Means (K = 2) trên mặt phẳng PC1–PC2"/>
                     <pic:cNvPicPr>
                       <a:picLocks noChangeAspect="1" noChangeArrowheads="1"/>
                     </pic:cNvPicPr>
                   </pic:nvPicPr>
                   <pic:blipFill>
-                    <a:blip r:embed="rId10"/>
-                    <a:srcRect/>
+                    <a:blip r:embed="rId10">
+                      <a:extLst>
+                        <a:ext uri="{28A0092B-C50C-407E-A947-70E740481C1C}">
+                          <a14:useLocalDpi xmlns:a14="http://schemas.microsoft.com/office/drawing/2010/main" val="0"/>
+                        </a:ext>
+                      </a:extLst>
+                    </a:blip>
+                    <a:srcRect r="-15" b="-84"/>
                     <a:stretch>
                       <a:fillRect/>
                     </a:stretch>
@@ -4181,11 +4267,15 @@
                   <pic:spPr bwMode="auto">
                     <a:xfrm>
                       <a:off x="0" y="0"/>
-                      <a:ext cx="4286250" cy="3038475"/>
+                      <a:ext cx="4287520" cy="3036570"/>
                     </a:xfrm>
                     <a:prstGeom prst="rect">
                       <a:avLst/>
                     </a:prstGeom>
+                    <a:noFill/>
+                    <a:ln>
+                      <a:noFill/>
+                    </a:ln>
                   </pic:spPr>
                 </pic:pic>
               </a:graphicData>
@@ -4246,7 +4336,7 @@
           <w:left w:w="10" w:type="dxa"/>
           <w:right w:w="10" w:type="dxa"/>
         </w:tblCellMar>
-        <w:tblLook w:val="0000" w:firstRow="0" w:lastRow="0" w:firstColumn="0" w:lastColumn="0" w:noHBand="0" w:noVBand="0"/>
+        <w:tblLook w:val="04A0" w:firstRow="1" w:lastRow="0" w:firstColumn="1" w:lastColumn="0" w:noHBand="0" w:noVBand="1"/>
       </w:tblPr>
       <w:tblGrid>
         <w:gridCol w:w="3360"/>
@@ -4273,6 +4363,7 @@
               <w:bottom w:w="60" w:type="dxa"/>
               <w:right w:w="90" w:type="dxa"/>
             </w:tcMar>
+            <w:hideMark/>
           </w:tcPr>
           <w:p>
             <w:pPr>
@@ -4309,6 +4400,7 @@
               <w:bottom w:w="60" w:type="dxa"/>
               <w:right w:w="90" w:type="dxa"/>
             </w:tcMar>
+            <w:hideMark/>
           </w:tcPr>
           <w:p>
             <w:pPr>
@@ -4345,6 +4437,7 @@
               <w:bottom w:w="60" w:type="dxa"/>
               <w:right w:w="90" w:type="dxa"/>
             </w:tcMar>
+            <w:hideMark/>
           </w:tcPr>
           <w:p>
             <w:pPr>
@@ -4382,6 +4475,7 @@
               <w:bottom w:w="60" w:type="dxa"/>
               <w:right w:w="90" w:type="dxa"/>
             </w:tcMar>
+            <w:hideMark/>
           </w:tcPr>
           <w:p>
             <w:pPr>
@@ -4416,6 +4510,7 @@
               <w:bottom w:w="60" w:type="dxa"/>
               <w:right w:w="90" w:type="dxa"/>
             </w:tcMar>
+            <w:hideMark/>
           </w:tcPr>
           <w:p>
             <w:pPr>
@@ -4449,6 +4544,7 @@
               <w:bottom w:w="60" w:type="dxa"/>
               <w:right w:w="90" w:type="dxa"/>
             </w:tcMar>
+            <w:hideMark/>
           </w:tcPr>
           <w:p>
             <w:pPr>
@@ -4484,6 +4580,7 @@
               <w:bottom w:w="60" w:type="dxa"/>
               <w:right w:w="90" w:type="dxa"/>
             </w:tcMar>
+            <w:hideMark/>
           </w:tcPr>
           <w:p>
             <w:pPr>
@@ -4518,6 +4615,7 @@
               <w:bottom w:w="60" w:type="dxa"/>
               <w:right w:w="90" w:type="dxa"/>
             </w:tcMar>
+            <w:hideMark/>
           </w:tcPr>
           <w:p>
             <w:pPr>
@@ -4551,6 +4649,7 @@
               <w:bottom w:w="60" w:type="dxa"/>
               <w:right w:w="90" w:type="dxa"/>
             </w:tcMar>
+            <w:hideMark/>
           </w:tcPr>
           <w:p>
             <w:pPr>
@@ -4586,6 +4685,7 @@
               <w:bottom w:w="60" w:type="dxa"/>
               <w:right w:w="90" w:type="dxa"/>
             </w:tcMar>
+            <w:hideMark/>
           </w:tcPr>
           <w:p>
             <w:pPr>
@@ -4620,6 +4720,7 @@
               <w:bottom w:w="60" w:type="dxa"/>
               <w:right w:w="90" w:type="dxa"/>
             </w:tcMar>
+            <w:hideMark/>
           </w:tcPr>
           <w:p>
             <w:pPr>
@@ -4653,6 +4754,7 @@
               <w:bottom w:w="60" w:type="dxa"/>
               <w:right w:w="90" w:type="dxa"/>
             </w:tcMar>
+            <w:hideMark/>
           </w:tcPr>
           <w:p>
             <w:pPr>
@@ -4688,6 +4790,7 @@
               <w:bottom w:w="60" w:type="dxa"/>
               <w:right w:w="90" w:type="dxa"/>
             </w:tcMar>
+            <w:hideMark/>
           </w:tcPr>
           <w:p>
             <w:pPr>
@@ -4722,6 +4825,7 @@
               <w:bottom w:w="60" w:type="dxa"/>
               <w:right w:w="90" w:type="dxa"/>
             </w:tcMar>
+            <w:hideMark/>
           </w:tcPr>
           <w:p>
             <w:pPr>
@@ -4755,6 +4859,7 @@
               <w:bottom w:w="60" w:type="dxa"/>
               <w:right w:w="90" w:type="dxa"/>
             </w:tcMar>
+            <w:hideMark/>
           </w:tcPr>
           <w:p>
             <w:pPr>
@@ -4790,6 +4895,7 @@
               <w:bottom w:w="60" w:type="dxa"/>
               <w:right w:w="90" w:type="dxa"/>
             </w:tcMar>
+            <w:hideMark/>
           </w:tcPr>
           <w:p>
             <w:pPr>
@@ -4824,6 +4930,7 @@
               <w:bottom w:w="60" w:type="dxa"/>
               <w:right w:w="90" w:type="dxa"/>
             </w:tcMar>
+            <w:hideMark/>
           </w:tcPr>
           <w:p>
             <w:pPr>
@@ -4857,6 +4964,7 @@
               <w:bottom w:w="60" w:type="dxa"/>
               <w:right w:w="90" w:type="dxa"/>
             </w:tcMar>
+            <w:hideMark/>
           </w:tcPr>
           <w:p>
             <w:pPr>
@@ -4892,6 +5000,7 @@
               <w:bottom w:w="60" w:type="dxa"/>
               <w:right w:w="90" w:type="dxa"/>
             </w:tcMar>
+            <w:hideMark/>
           </w:tcPr>
           <w:p>
             <w:pPr>
@@ -4926,6 +5035,7 @@
               <w:bottom w:w="60" w:type="dxa"/>
               <w:right w:w="90" w:type="dxa"/>
             </w:tcMar>
+            <w:hideMark/>
           </w:tcPr>
           <w:p>
             <w:pPr>
@@ -4959,6 +5069,7 @@
               <w:bottom w:w="60" w:type="dxa"/>
               <w:right w:w="90" w:type="dxa"/>
             </w:tcMar>
+            <w:hideMark/>
           </w:tcPr>
           <w:p>
             <w:pPr>
@@ -5011,7 +5122,7 @@
         <w:pStyle w:val="ListParagraph"/>
         <w:numPr>
           <w:ilvl w:val="0"/>
-          <w:numId w:val="2"/>
+          <w:numId w:val="8"/>
         </w:numPr>
         <w:spacing w:after="80" w:line="300" w:lineRule="auto"/>
         <w:rPr>
@@ -5041,7 +5152,7 @@
         <w:pStyle w:val="ListParagraph"/>
         <w:numPr>
           <w:ilvl w:val="0"/>
-          <w:numId w:val="2"/>
+          <w:numId w:val="8"/>
         </w:numPr>
         <w:spacing w:after="80" w:line="300" w:lineRule="auto"/>
         <w:rPr>
@@ -5202,7 +5313,7 @@
           <w:left w:w="10" w:type="dxa"/>
           <w:right w:w="10" w:type="dxa"/>
         </w:tblCellMar>
-        <w:tblLook w:val="0000" w:firstRow="0" w:lastRow="0" w:firstColumn="0" w:lastColumn="0" w:noHBand="0" w:noVBand="0"/>
+        <w:tblLook w:val="04A0" w:firstRow="1" w:lastRow="0" w:firstColumn="1" w:lastColumn="0" w:noHBand="0" w:noVBand="1"/>
       </w:tblPr>
       <w:tblGrid>
         <w:gridCol w:w="3360"/>
@@ -5229,6 +5340,7 @@
               <w:bottom w:w="60" w:type="dxa"/>
               <w:right w:w="90" w:type="dxa"/>
             </w:tcMar>
+            <w:hideMark/>
           </w:tcPr>
           <w:p>
             <w:pPr>
@@ -5265,6 +5377,7 @@
               <w:bottom w:w="60" w:type="dxa"/>
               <w:right w:w="90" w:type="dxa"/>
             </w:tcMar>
+            <w:hideMark/>
           </w:tcPr>
           <w:p>
             <w:pPr>
@@ -5301,6 +5414,7 @@
               <w:bottom w:w="60" w:type="dxa"/>
               <w:right w:w="90" w:type="dxa"/>
             </w:tcMar>
+            <w:hideMark/>
           </w:tcPr>
           <w:p>
             <w:pPr>
@@ -5338,6 +5452,7 @@
               <w:bottom w:w="60" w:type="dxa"/>
               <w:right w:w="90" w:type="dxa"/>
             </w:tcMar>
+            <w:hideMark/>
           </w:tcPr>
           <w:p>
             <w:pPr>
@@ -5372,6 +5487,7 @@
               <w:bottom w:w="60" w:type="dxa"/>
               <w:right w:w="90" w:type="dxa"/>
             </w:tcMar>
+            <w:hideMark/>
           </w:tcPr>
           <w:p>
             <w:pPr>
@@ -5405,6 +5521,7 @@
               <w:bottom w:w="60" w:type="dxa"/>
               <w:right w:w="90" w:type="dxa"/>
             </w:tcMar>
+            <w:hideMark/>
           </w:tcPr>
           <w:p>
             <w:pPr>
@@ -5440,6 +5557,7 @@
               <w:bottom w:w="60" w:type="dxa"/>
               <w:right w:w="90" w:type="dxa"/>
             </w:tcMar>
+            <w:hideMark/>
           </w:tcPr>
           <w:p>
             <w:pPr>
@@ -5474,6 +5592,7 @@
               <w:bottom w:w="60" w:type="dxa"/>
               <w:right w:w="90" w:type="dxa"/>
             </w:tcMar>
+            <w:hideMark/>
           </w:tcPr>
           <w:p>
             <w:pPr>
@@ -5507,6 +5626,7 @@
               <w:bottom w:w="60" w:type="dxa"/>
               <w:right w:w="90" w:type="dxa"/>
             </w:tcMar>
+            <w:hideMark/>
           </w:tcPr>
           <w:p>
             <w:pPr>
@@ -5542,6 +5662,7 @@
               <w:bottom w:w="60" w:type="dxa"/>
               <w:right w:w="90" w:type="dxa"/>
             </w:tcMar>
+            <w:hideMark/>
           </w:tcPr>
           <w:p>
             <w:pPr>
@@ -5576,6 +5697,7 @@
               <w:bottom w:w="60" w:type="dxa"/>
               <w:right w:w="90" w:type="dxa"/>
             </w:tcMar>
+            <w:hideMark/>
           </w:tcPr>
           <w:p>
             <w:pPr>
@@ -5609,6 +5731,7 @@
               <w:bottom w:w="60" w:type="dxa"/>
               <w:right w:w="90" w:type="dxa"/>
             </w:tcMar>
+            <w:hideMark/>
           </w:tcPr>
           <w:p>
             <w:pPr>
@@ -5644,6 +5767,7 @@
               <w:bottom w:w="60" w:type="dxa"/>
               <w:right w:w="90" w:type="dxa"/>
             </w:tcMar>
+            <w:hideMark/>
           </w:tcPr>
           <w:p>
             <w:pPr>
@@ -5678,6 +5802,7 @@
               <w:bottom w:w="60" w:type="dxa"/>
               <w:right w:w="90" w:type="dxa"/>
             </w:tcMar>
+            <w:hideMark/>
           </w:tcPr>
           <w:p>
             <w:pPr>
@@ -5711,6 +5836,7 @@
               <w:bottom w:w="60" w:type="dxa"/>
               <w:right w:w="90" w:type="dxa"/>
             </w:tcMar>
+            <w:hideMark/>
           </w:tcPr>
           <w:p>
             <w:pPr>
@@ -5764,7 +5890,7 @@
         <w:pStyle w:val="ListParagraph"/>
         <w:numPr>
           <w:ilvl w:val="0"/>
-          <w:numId w:val="3"/>
+          <w:numId w:val="9"/>
         </w:numPr>
         <w:spacing w:after="80" w:line="300" w:lineRule="auto"/>
         <w:rPr>
@@ -5794,7 +5920,7 @@
         <w:pStyle w:val="ListParagraph"/>
         <w:numPr>
           <w:ilvl w:val="0"/>
-          <w:numId w:val="3"/>
+          <w:numId w:val="9"/>
         </w:numPr>
         <w:spacing w:after="80" w:line="300" w:lineRule="auto"/>
         <w:rPr>
@@ -5840,7 +5966,7 @@
         <w:pStyle w:val="ListParagraph"/>
         <w:numPr>
           <w:ilvl w:val="0"/>
-          <w:numId w:val="3"/>
+          <w:numId w:val="9"/>
         </w:numPr>
         <w:spacing w:after="80" w:line="300" w:lineRule="auto"/>
         <w:rPr>
@@ -5870,7 +5996,7 @@
         <w:pStyle w:val="ListParagraph"/>
         <w:numPr>
           <w:ilvl w:val="0"/>
-          <w:numId w:val="3"/>
+          <w:numId w:val="9"/>
         </w:numPr>
         <w:spacing w:after="80" w:line="300" w:lineRule="auto"/>
         <w:rPr>
@@ -5971,7 +6097,7 @@
         <w:pStyle w:val="ListParagraph"/>
         <w:numPr>
           <w:ilvl w:val="0"/>
-          <w:numId w:val="2"/>
+          <w:numId w:val="8"/>
         </w:numPr>
         <w:spacing w:after="80" w:line="300" w:lineRule="auto"/>
         <w:rPr>
@@ -6008,7 +6134,7 @@
         <w:pStyle w:val="ListParagraph"/>
         <w:numPr>
           <w:ilvl w:val="0"/>
-          <w:numId w:val="2"/>
+          <w:numId w:val="8"/>
         </w:numPr>
         <w:spacing w:after="80" w:line="300" w:lineRule="auto"/>
         <w:rPr>
@@ -6045,7 +6171,7 @@
         <w:pStyle w:val="ListParagraph"/>
         <w:numPr>
           <w:ilvl w:val="0"/>
-          <w:numId w:val="2"/>
+          <w:numId w:val="8"/>
         </w:numPr>
         <w:spacing w:after="80" w:line="300" w:lineRule="auto"/>
         <w:rPr>
@@ -6098,7 +6224,7 @@
         <w:pStyle w:val="ListParagraph"/>
         <w:numPr>
           <w:ilvl w:val="0"/>
-          <w:numId w:val="2"/>
+          <w:numId w:val="8"/>
         </w:numPr>
         <w:spacing w:after="80" w:line="300" w:lineRule="auto"/>
         <w:rPr>
@@ -6119,7 +6245,7 @@
         <w:pStyle w:val="ListParagraph"/>
         <w:numPr>
           <w:ilvl w:val="0"/>
-          <w:numId w:val="2"/>
+          <w:numId w:val="8"/>
         </w:numPr>
         <w:spacing w:after="80" w:line="300" w:lineRule="auto"/>
         <w:rPr>
@@ -6189,26 +6315,16 @@
           <w:sz w:val="24"/>
           <w:szCs w:val="24"/>
         </w:rPr>
-        <w:t>Nhóm xây dựng bài toán học có giám sát trên bộ dữ liệu giao dịch</w:t>
-      </w:r>
-      <w:r>
-        <w:rPr>
-          <w:sz w:val="24"/>
-          <w:szCs w:val="24"/>
-        </w:rPr>
-        <w:t xml:space="preserve"> đã được nêu ở trên</w:t>
-      </w:r>
-      <w:r>
-        <w:rPr>
-          <w:sz w:val="24"/>
-          <w:szCs w:val="24"/>
-        </w:rPr>
-        <w:t>. Với mỗi bài toán, nhóm so sánh 2 mô hình rồi chọn ra mô hình tốt hơn dựa trên các chỉ số đánh giá.</w:t>
+        <w:t>Nhóm xây dựng bài toán học có giám sát trên bộ dữ liệu giao dịch đã được nêu ở trên. Với mỗi bài toán, nhóm so sánh 2 mô hình rồi chọn ra mô hình tốt hơn dựa trên các chỉ số đánh giá.</w:t>
       </w:r>
     </w:p>
     <w:p>
       <w:pPr>
         <w:pStyle w:val="ListBullet"/>
+        <w:numPr>
+          <w:ilvl w:val="0"/>
+          <w:numId w:val="7"/>
+        </w:numPr>
         <w:spacing w:after="120" w:line="312" w:lineRule="auto"/>
         <w:rPr>
           <w:rFonts w:cs="Times New Roman"/>
@@ -6234,12 +6350,16 @@
           <w:sz w:val="24"/>
           <w:szCs w:val="24"/>
         </w:rPr>
-        <w:t xml:space="preserve"> dự đoán giá trị đơn hàng TotalAmount (VND), so sánh LinearRegression và DecisionTreeRegressor.</w:t>
+        <w:t xml:space="preserve"> dự đoán giá sản phẩm Price (VND) từ nhóm sản phẩm, thương hiệu và điểm đánh giá, so sánh LinearRegression và DecisionTreeRegressor.</w:t>
       </w:r>
     </w:p>
     <w:p>
       <w:pPr>
         <w:pStyle w:val="ListBullet"/>
+        <w:numPr>
+          <w:ilvl w:val="0"/>
+          <w:numId w:val="7"/>
+        </w:numPr>
         <w:spacing w:after="120" w:line="312" w:lineRule="auto"/>
         <w:rPr>
           <w:rFonts w:cs="Times New Roman"/>
@@ -6315,22 +6435,7 @@
           <w:sz w:val="24"/>
           <w:szCs w:val="24"/>
         </w:rPr>
-        <w:t xml:space="preserve"> (200 đơn để kiểm tra) và dùng random_state=42 để kết quả chạy lại luôn giống nhau. Các chỉ số trong báo cáo đều được tính trên </w:t>
-      </w:r>
-      <w:r>
-        <w:rPr>
-          <w:b/>
-          <w:sz w:val="24"/>
-          <w:szCs w:val="24"/>
-        </w:rPr>
-        <w:t>tập test</w:t>
-      </w:r>
-      <w:r>
-        <w:rPr>
-          <w:sz w:val="24"/>
-          <w:szCs w:val="24"/>
-        </w:rPr>
-        <w:t>.</w:t>
+        <w:t xml:space="preserve"> và dùng random_state=42 để kết quả chạy lại luôn giống nhau. Bài toán hồi quy làm việc trên bảng 392 sản phẩm (313 train, 79 test); bài toán phân loại làm việc trên 1.000 đơn hàng (200 đơn để kiểm tra). Các chỉ số trong báo cáo đều được tính trên tập test.</w:t>
       </w:r>
     </w:p>
     <w:p>
@@ -6365,14 +6470,14 @@
           <w:sz w:val="24"/>
           <w:szCs w:val="24"/>
         </w:rPr>
-        <w:t>Mô hình thắng: DecisionTreeRegressor</w:t>
-      </w:r>
-      <w:r>
-        <w:rPr>
-          <w:sz w:val="24"/>
-          <w:szCs w:val="24"/>
-        </w:rPr>
-        <w:t xml:space="preserve"> tốt hơn Linear Regression ở cả 3 chỉ số MSE, RMSE và R².</w:t>
+        <w:t>Mô hình thắng: LinearRegression</w:t>
+      </w:r>
+      <w:r>
+        <w:rPr>
+          <w:sz w:val="24"/>
+          <w:szCs w:val="24"/>
+        </w:rPr>
+        <w:t xml:space="preserve"> tốt hơn Decision Tree ở cả 3 chỉ số MSE, RMSE và R² trên tập test.</w:t>
       </w:r>
     </w:p>
     <w:p>
@@ -6396,7 +6501,15 @@
           <w:sz w:val="24"/>
           <w:szCs w:val="24"/>
         </w:rPr>
-        <w:t xml:space="preserve"> biến mục tiêu là TotalAmount; đặc trưng gồm Age, UnitPrice, Quantity, Rating. Nhóm có thêm một mô hình cơ sở (baseline) luôn dự đoán bằng giá trị trung bình của tập train để làm mốc so sánh.</w:t>
+        <w:t xml:space="preserve"> biến mục tiêu là Price (giá một sản phẩm); đặc trưng gồm Category, Brand và Rating. Vì Price, Category, Brand, Rating là thông tin của sản phẩm chứ không phải của đơn hàng, nhóm gộp 1.000 đơn về 392 sản phẩm khác nhau (mỗi sản phẩm một dòng) rồi mới chia train/test. Nếu chia trực tiếp trên đơn hàng thì cùng một sản phẩm có thể nằm ở cả hai tập và điểm test sẽ cao giả tạo. Category và Brand được mã hóa One-Hot bên trong Pipeline, nên khi lưu mô hình bước mã hóa cũng được lưu theo. Nhóm không dùng UnitPrice, </w:t>
+      </w:r>
+      <w:r>
+        <w:rPr>
+          <w:sz w:val="24"/>
+          <w:szCs w:val="24"/>
+        </w:rPr>
+        <w:lastRenderedPageBreak/>
+        <w:t>Quantity hay TotalAmount làm đặc trưng. Baseline luôn dự đoán bằng giá trung bình của tập train (khoảng 96.086 VND) để làm mốc so sánh.</w:t>
       </w:r>
     </w:p>
     <w:tbl>
@@ -6639,7 +6752,7 @@
                 <w:sz w:val="24"/>
                 <w:szCs w:val="24"/>
               </w:rPr>
-              <w:t>3,95 × 10¹⁰</w:t>
+              <w:t>3,88 × 10⁹</w:t>
             </w:r>
           </w:p>
         </w:tc>
@@ -6669,7 +6782,7 @@
                 <w:sz w:val="24"/>
                 <w:szCs w:val="24"/>
               </w:rPr>
-              <w:t>198.666</w:t>
+              <w:t>62.302</w:t>
             </w:r>
           </w:p>
         </w:tc>
@@ -6699,7 +6812,7 @@
                 <w:sz w:val="24"/>
                 <w:szCs w:val="24"/>
               </w:rPr>
-              <w:t>-0,020</w:t>
+              <w:t>-0,044</w:t>
             </w:r>
           </w:p>
         </w:tc>
@@ -6729,7 +6842,7 @@
                 <w:sz w:val="24"/>
                 <w:szCs w:val="24"/>
               </w:rPr>
-              <w:t>–</w:t>
+              <w:t>--</w:t>
             </w:r>
           </w:p>
         </w:tc>
@@ -6760,6 +6873,7 @@
             <w:r>
               <w:rPr>
                 <w:rFonts w:ascii="Times New Roman" w:hAnsi="Times New Roman" w:cs="Times New Roman"/>
+                <w:b/>
                 <w:sz w:val="24"/>
                 <w:szCs w:val="24"/>
               </w:rPr>
@@ -6790,10 +6904,11 @@
             <w:r>
               <w:rPr>
                 <w:rFonts w:ascii="Times New Roman" w:hAnsi="Times New Roman" w:cs="Times New Roman"/>
-                <w:sz w:val="24"/>
-                <w:szCs w:val="24"/>
-              </w:rPr>
-              <w:t>5,61 × 10⁹</w:t>
+                <w:b/>
+                <w:sz w:val="24"/>
+                <w:szCs w:val="24"/>
+              </w:rPr>
+              <w:t>2,35 × 10⁹</w:t>
             </w:r>
           </w:p>
         </w:tc>
@@ -6820,10 +6935,11 @@
             <w:r>
               <w:rPr>
                 <w:rFonts w:ascii="Times New Roman" w:hAnsi="Times New Roman" w:cs="Times New Roman"/>
-                <w:sz w:val="24"/>
-                <w:szCs w:val="24"/>
-              </w:rPr>
-              <w:t>74.896</w:t>
+                <w:b/>
+                <w:sz w:val="24"/>
+                <w:szCs w:val="24"/>
+              </w:rPr>
+              <w:t>48.444</w:t>
             </w:r>
           </w:p>
         </w:tc>
@@ -6850,10 +6966,11 @@
             <w:r>
               <w:rPr>
                 <w:rFonts w:ascii="Times New Roman" w:hAnsi="Times New Roman" w:cs="Times New Roman"/>
-                <w:sz w:val="24"/>
-                <w:szCs w:val="24"/>
-              </w:rPr>
-              <w:t>0,855</w:t>
+                <w:b/>
+                <w:sz w:val="24"/>
+                <w:szCs w:val="24"/>
+              </w:rPr>
+              <w:t>0,369</w:t>
             </w:r>
           </w:p>
         </w:tc>
@@ -6880,10 +6997,11 @@
             <w:r>
               <w:rPr>
                 <w:rFonts w:ascii="Times New Roman" w:hAnsi="Times New Roman" w:cs="Times New Roman"/>
-                <w:sz w:val="24"/>
-                <w:szCs w:val="24"/>
-              </w:rPr>
-              <w:t>0,825</w:t>
+                <w:b/>
+                <w:sz w:val="24"/>
+                <w:szCs w:val="24"/>
+              </w:rPr>
+              <w:t>0,827</w:t>
             </w:r>
           </w:p>
         </w:tc>
@@ -6914,11 +7032,10 @@
             <w:r>
               <w:rPr>
                 <w:rFonts w:ascii="Times New Roman" w:hAnsi="Times New Roman" w:cs="Times New Roman"/>
-                <w:b/>
-                <w:sz w:val="24"/>
-                <w:szCs w:val="24"/>
-              </w:rPr>
-              <w:t>Decision Tree Regressor</w:t>
+                <w:sz w:val="24"/>
+                <w:szCs w:val="24"/>
+              </w:rPr>
+              <w:t>Decision Tree Regressor (max_depth=3)</w:t>
             </w:r>
           </w:p>
         </w:tc>
@@ -6945,11 +7062,10 @@
             <w:r>
               <w:rPr>
                 <w:rFonts w:ascii="Times New Roman" w:hAnsi="Times New Roman" w:cs="Times New Roman"/>
-                <w:b/>
-                <w:sz w:val="24"/>
-                <w:szCs w:val="24"/>
-              </w:rPr>
-              <w:t>8,83 × 10⁸</w:t>
+                <w:sz w:val="24"/>
+                <w:szCs w:val="24"/>
+              </w:rPr>
+              <w:t>2,89 × 10⁹</w:t>
             </w:r>
           </w:p>
         </w:tc>
@@ -6976,11 +7092,10 @@
             <w:r>
               <w:rPr>
                 <w:rFonts w:ascii="Times New Roman" w:hAnsi="Times New Roman" w:cs="Times New Roman"/>
-                <w:b/>
-                <w:sz w:val="24"/>
-                <w:szCs w:val="24"/>
-              </w:rPr>
-              <w:t>29.716</w:t>
+                <w:sz w:val="24"/>
+                <w:szCs w:val="24"/>
+              </w:rPr>
+              <w:t>53.756</w:t>
             </w:r>
           </w:p>
         </w:tc>
@@ -7007,11 +7122,10 @@
             <w:r>
               <w:rPr>
                 <w:rFonts w:ascii="Times New Roman" w:hAnsi="Times New Roman" w:cs="Times New Roman"/>
-                <w:b/>
-                <w:sz w:val="24"/>
-                <w:szCs w:val="24"/>
-              </w:rPr>
-              <w:t>0,977</w:t>
+                <w:sz w:val="24"/>
+                <w:szCs w:val="24"/>
+              </w:rPr>
+              <w:t>0,222</w:t>
             </w:r>
           </w:p>
         </w:tc>
@@ -7038,11 +7152,10 @@
             <w:r>
               <w:rPr>
                 <w:rFonts w:ascii="Times New Roman" w:hAnsi="Times New Roman" w:cs="Times New Roman"/>
-                <w:b/>
-                <w:sz w:val="24"/>
-                <w:szCs w:val="24"/>
-              </w:rPr>
-              <w:t>1,000</w:t>
+                <w:sz w:val="24"/>
+                <w:szCs w:val="24"/>
+              </w:rPr>
+              <w:t>0,356</w:t>
             </w:r>
           </w:p>
         </w:tc>
@@ -7101,6 +7214,10 @@
     <w:p>
       <w:pPr>
         <w:pStyle w:val="ListBullet"/>
+        <w:numPr>
+          <w:ilvl w:val="0"/>
+          <w:numId w:val="7"/>
+        </w:numPr>
         <w:spacing w:after="120" w:line="312" w:lineRule="auto"/>
         <w:rPr>
           <w:rFonts w:cs="Times New Roman"/>
@@ -7126,12 +7243,16 @@
           <w:sz w:val="24"/>
           <w:szCs w:val="24"/>
         </w:rPr>
-        <w:t xml:space="preserve"> (baseline có R² gần bằng 0), nghĩa là các đặc trưng thực sự có ích.</w:t>
+        <w:t xml:space="preserve"> (baseline có R² âm, tức không tốt hơn việc luôn đoán giá trung bình), nghĩa là loại sản phẩm và thương hiệu có giúp đoán giá.</w:t>
       </w:r>
     </w:p>
     <w:p>
       <w:pPr>
         <w:pStyle w:val="ListBullet"/>
+        <w:numPr>
+          <w:ilvl w:val="0"/>
+          <w:numId w:val="7"/>
+        </w:numPr>
         <w:spacing w:after="120" w:line="312" w:lineRule="auto"/>
         <w:rPr>
           <w:rFonts w:cs="Times New Roman"/>
@@ -7148,7 +7269,7 @@
           <w:sz w:val="24"/>
           <w:szCs w:val="24"/>
         </w:rPr>
-        <w:t>Decision Tree chính xác hơn rõ rệt:</w:t>
+        <w:t>Linear Regression chính xác hơn:</w:t>
       </w:r>
       <w:r>
         <w:rPr>
@@ -7157,12 +7278,16 @@
           <w:sz w:val="24"/>
           <w:szCs w:val="24"/>
         </w:rPr>
-        <w:t xml:space="preserve"> RMSE chỉ còn khoảng 29,7 nghìn VND, giảm hơn một nửa so với Linear Regression (khoảng 74,9 nghìn VND). R² tăng từ 0,855 lên 0,977.</w:t>
+        <w:t xml:space="preserve"> RMSE khoảng 48,4 nghìn VND so với 53,8 nghìn VND của Decision Tree; R² Test 0,369 so với 0,222. Tuy vậy R² chỉ khoảng 0,37 nên mô hình chỉ giải thích được một phần giá, và RMSE vẫn lớn so với giá trung bình khoảng 93.500 VND.</w:t>
       </w:r>
     </w:p>
     <w:p>
       <w:pPr>
         <w:pStyle w:val="ListBullet"/>
+        <w:numPr>
+          <w:ilvl w:val="0"/>
+          <w:numId w:val="7"/>
+        </w:numPr>
         <w:spacing w:after="120" w:line="312" w:lineRule="auto"/>
         <w:rPr>
           <w:rFonts w:cs="Times New Roman"/>
@@ -7179,7 +7304,7 @@
           <w:sz w:val="24"/>
           <w:szCs w:val="24"/>
         </w:rPr>
-        <w:t>Vì sao Linear Regression kém hơn?</w:t>
+        <w:t>Vì sao Decision Tree kém hơn?</w:t>
       </w:r>
       <w:r>
         <w:rPr>
@@ -7188,31 +7313,16 @@
           <w:sz w:val="24"/>
           <w:szCs w:val="24"/>
         </w:rPr>
-        <w:t xml:space="preserve"> Vì TotalAmount = UnitPrice × Quantity là phép </w:t>
-      </w:r>
-      <w:r>
-        <w:rPr>
-          <w:rFonts w:cs="Times New Roman"/>
-          <w:i/>
-          <w:color w:val="auto"/>
-          <w:sz w:val="24"/>
-          <w:szCs w:val="24"/>
-        </w:rPr>
-        <w:t>nhân</w:t>
-      </w:r>
-      <w:r>
-        <w:rPr>
-          <w:rFonts w:cs="Times New Roman"/>
-          <w:color w:val="auto"/>
-          <w:sz w:val="24"/>
-          <w:szCs w:val="24"/>
-        </w:rPr>
-        <w:t>, trong khi hồi quy tuyến tính chỉ cộng các đặc trưng lại. Cây quyết định chia nhánh theo UnitPrice và Quantity nên xấp xỉ được quan hệ này tốt hơn.</w:t>
+        <w:t xml:space="preserve"> Nhóm thử max_depth = 2, 3, 4, 5, 6, 8 và chọn độ sâu có R² cross-validation cao nhất trên tập train (không dùng tập test để chọn), kết quả là max_depth = 3. Tuy vậy R² cross-validation của mọi độ sâu đều rất thấp (dưới 0,07), tức cây sâu hơn chỉ học thuộc dữ liệu train. Cây độ sâu 3 chỉ có tối đa 8 nhóm lá nên chỉ cho ra vài mức giá cố định.</w:t>
       </w:r>
     </w:p>
     <w:p>
       <w:pPr>
         <w:pStyle w:val="ListBullet"/>
+        <w:numPr>
+          <w:ilvl w:val="0"/>
+          <w:numId w:val="7"/>
+        </w:numPr>
         <w:spacing w:after="120" w:line="312" w:lineRule="auto"/>
         <w:rPr>
           <w:rFonts w:cs="Times New Roman"/>
@@ -7238,8 +7348,24 @@
           <w:sz w:val="24"/>
           <w:szCs w:val="24"/>
         </w:rPr>
-        <w:t xml:space="preserve"> các điểm của Decision Tree nằm sát đường chéo lý tưởng. Linear Regression thì phân tán xa hơn, thậm chí dự đoán ra </w:t>
-      </w:r>
+        <w:t xml:space="preserve"> các điểm của Linear Regression phân tán quanh đường chéo, đúng xu hướng chung nhưng còn lệch nhiều ở sản phẩm giá cao. Các điểm của Decision Tree xếp thành vài cột thẳng đứng vì chỉ có vài mức giá dự đoán. Ở tập test, Linear Regression không dự đoán ra giá âm (0/79).</w:t>
+      </w:r>
+    </w:p>
+    <w:p>
+      <w:pPr>
+        <w:pStyle w:val="ListBullet"/>
+        <w:numPr>
+          <w:ilvl w:val="0"/>
+          <w:numId w:val="7"/>
+        </w:numPr>
+        <w:spacing w:after="120" w:line="312" w:lineRule="auto"/>
+        <w:rPr>
+          <w:rFonts w:cs="Times New Roman"/>
+          <w:color w:val="auto"/>
+          <w:sz w:val="24"/>
+          <w:szCs w:val="24"/>
+        </w:rPr>
+      </w:pPr>
       <w:r>
         <w:rPr>
           <w:rFonts w:cs="Times New Roman"/>
@@ -7248,7 +7374,7 @@
           <w:sz w:val="24"/>
           <w:szCs w:val="24"/>
         </w:rPr>
-        <w:t>giá trị âm ở 28/200 đơn</w:t>
+        <w:t>Biểu đồ Residual:</w:t>
       </w:r>
       <w:r>
         <w:rPr>
@@ -7257,12 +7383,16 @@
           <w:sz w:val="24"/>
           <w:szCs w:val="24"/>
         </w:rPr>
-        <w:t>, điều không hợp lý vì mọi đơn đều từ 10.000 VND trở lên.</w:t>
+        <w:t xml:space="preserve"> phần dư của Linear Regression khá ngẫu nhiên ở vùng giá thấp nhưng tản rộng dần khi giá dự đoán tăng (dạng hơi giống cái phễu), và ở vùng dự đoán cao phần dư chủ yếu là số âm, nghĩa là mô hình đoán cao hơn giá thật. Đây là sai số có hệ thống ở nhóm sản phẩm giá cao. Phần dư của Decision Tree xếp thành các cột theo từng mức dự đoán, cột giữa (khoảng 97.000 VND) trải rất rộng.</w:t>
       </w:r>
     </w:p>
     <w:p>
       <w:pPr>
         <w:pStyle w:val="ListBullet"/>
+        <w:numPr>
+          <w:ilvl w:val="0"/>
+          <w:numId w:val="7"/>
+        </w:numPr>
         <w:spacing w:after="120" w:line="312" w:lineRule="auto"/>
         <w:rPr>
           <w:rFonts w:cs="Times New Roman"/>
@@ -7279,7 +7409,7 @@
           <w:sz w:val="24"/>
           <w:szCs w:val="24"/>
         </w:rPr>
-        <w:t>Biểu đồ Residual:</w:t>
+        <w:t>Overfitting:</w:t>
       </w:r>
       <w:r>
         <w:rPr>
@@ -7288,12 +7418,16 @@
           <w:sz w:val="24"/>
           <w:szCs w:val="24"/>
         </w:rPr>
-        <w:t xml:space="preserve"> phần dư của Linear Regression tạo thành đường cong rõ rệt (sai số có hệ thống), còn phần dư của Decision Tree tập trung gần đường 0.</w:t>
+        <w:t xml:space="preserve"> Linear Regression có R² Train 0,827 so với R² Test 0,369, có dấu hiệu overfitting vì sau One-Hot có hàng trăm cột (91 thương hiệu và 27 loại) trong khi chỉ có 313 sản phẩm để học. Decision Tree độ sâu 3 ít overfitting hơn (Train 0,356, Test 0,222) nhưng cũng học được ít hơn.</w:t>
       </w:r>
     </w:p>
     <w:p>
       <w:pPr>
         <w:pStyle w:val="ListBullet"/>
+        <w:numPr>
+          <w:ilvl w:val="0"/>
+          <w:numId w:val="7"/>
+        </w:numPr>
         <w:spacing w:after="120" w:line="312" w:lineRule="auto"/>
         <w:rPr>
           <w:rFonts w:cs="Times New Roman"/>
@@ -7310,7 +7444,7 @@
           <w:sz w:val="24"/>
           <w:szCs w:val="24"/>
         </w:rPr>
-        <w:t>Overfitting:</w:t>
+        <w:t>Kiểm tra lại bằng cross-validation 5 lần trên toàn bộ 392 sản phẩm:</w:t>
       </w:r>
       <w:r>
         <w:rPr>
@@ -7319,17 +7453,7 @@
           <w:sz w:val="24"/>
           <w:szCs w:val="24"/>
         </w:rPr>
-        <w:t xml:space="preserve"> R² Train của Decision Tree bằng 1,0 còn R² Test là 0,977, tức cây hơi "học thuộc" tập train. Tuy nhiên chênh lệch nhỏ, và khi nhóm thử giảm max_depth thì R² Test không hề tăng lên (cao nhất vẫn là 0,977 ở độ sâu 15), nên nhóm giữ cây không giới hạn độ sâu. Linear Regression thì không bị overfitting (R² Train 0,825 và Test 0,855 gần nhau) nhưng bị </w:t>
-      </w:r>
-      <w:r>
-        <w:rPr>
-          <w:rFonts w:cs="Times New Roman"/>
-          <w:i/>
-          <w:color w:val="auto"/>
-          <w:sz w:val="24"/>
-          <w:szCs w:val="24"/>
-        </w:rPr>
-        <w:t>underfitting</w:t>
+        <w:t xml:space="preserve"> Linear Regression có R² trung bình khoảng 0,39 (từng lần từ 0,23 đến 0,57), Decision Tree khoảng 0,06. Kết luận cùng chiều với tập test, nhưng điểm giữa các lần chia dao động khá </w:t>
       </w:r>
       <w:r>
         <w:rPr>
@@ -7338,38 +7462,8 @@
           <w:sz w:val="24"/>
           <w:szCs w:val="24"/>
         </w:rPr>
-        <w:t xml:space="preserve"> vì mô hình quá đơn giản.</w:t>
-      </w:r>
-    </w:p>
-    <w:p>
-      <w:pPr>
-        <w:pStyle w:val="ListBullet"/>
-        <w:spacing w:after="120" w:line="312" w:lineRule="auto"/>
-        <w:rPr>
-          <w:rFonts w:cs="Times New Roman"/>
-          <w:color w:val="auto"/>
-          <w:sz w:val="24"/>
-          <w:szCs w:val="24"/>
-        </w:rPr>
-      </w:pPr>
-      <w:r>
-        <w:rPr>
-          <w:rFonts w:cs="Times New Roman"/>
-          <w:b/>
-          <w:color w:val="auto"/>
-          <w:sz w:val="24"/>
-          <w:szCs w:val="24"/>
-        </w:rPr>
-        <w:t>Độ quan trọng đặc trưng:</w:t>
-      </w:r>
-      <w:r>
-        <w:rPr>
-          <w:rFonts w:cs="Times New Roman"/>
-          <w:color w:val="auto"/>
-          <w:sz w:val="24"/>
-          <w:szCs w:val="24"/>
-        </w:rPr>
-        <w:t xml:space="preserve"> UnitPrice (0,57) và Quantity (0,43) chiếm gần như toàn bộ; Rating và Age gần bằng 0.</w:t>
+        <w:lastRenderedPageBreak/>
+        <w:t>nhiều nên đây chỉ là ước lượng thô. Ngoài ra Rating gần như không tương quan với Price (hệ số khoảng -0,06), còn Category và Brand mới là hai yếu tố giải thích giá.</w:t>
       </w:r>
     </w:p>
     <w:p>
@@ -7672,7 +7766,6 @@
                 <w:sz w:val="24"/>
                 <w:szCs w:val="24"/>
               </w:rPr>
-              <w:lastRenderedPageBreak/>
               <w:t>Logistic Regression (không class_weight)</w:t>
             </w:r>
           </w:p>
@@ -8688,6 +8781,10 @@
     <w:p>
       <w:pPr>
         <w:pStyle w:val="ListBullet"/>
+        <w:numPr>
+          <w:ilvl w:val="0"/>
+          <w:numId w:val="7"/>
+        </w:numPr>
         <w:spacing w:after="120" w:line="312" w:lineRule="auto"/>
         <w:rPr>
           <w:rFonts w:cs="Times New Roman"/>
@@ -8719,6 +8816,10 @@
     <w:p>
       <w:pPr>
         <w:pStyle w:val="ListBullet"/>
+        <w:numPr>
+          <w:ilvl w:val="0"/>
+          <w:numId w:val="7"/>
+        </w:numPr>
         <w:spacing w:after="120" w:line="312" w:lineRule="auto"/>
         <w:rPr>
           <w:rFonts w:cs="Times New Roman"/>
@@ -8735,6 +8836,7 @@
           <w:sz w:val="24"/>
           <w:szCs w:val="24"/>
         </w:rPr>
+        <w:lastRenderedPageBreak/>
         <w:t>Logistic Regression cân bằng hơn:</w:t>
       </w:r>
       <w:r>
@@ -8750,6 +8852,10 @@
     <w:p>
       <w:pPr>
         <w:pStyle w:val="ListBullet"/>
+        <w:numPr>
+          <w:ilvl w:val="0"/>
+          <w:numId w:val="7"/>
+        </w:numPr>
         <w:spacing w:after="120" w:line="312" w:lineRule="auto"/>
         <w:rPr>
           <w:rFonts w:cs="Times New Roman"/>
@@ -8781,6 +8887,10 @@
     <w:p>
       <w:pPr>
         <w:pStyle w:val="ListBullet"/>
+        <w:numPr>
+          <w:ilvl w:val="0"/>
+          <w:numId w:val="7"/>
+        </w:numPr>
         <w:spacing w:after="120" w:line="312" w:lineRule="auto"/>
         <w:rPr>
           <w:rFonts w:cs="Times New Roman"/>
@@ -8812,6 +8922,10 @@
     <w:p>
       <w:pPr>
         <w:pStyle w:val="ListBullet"/>
+        <w:numPr>
+          <w:ilvl w:val="0"/>
+          <w:numId w:val="7"/>
+        </w:numPr>
         <w:spacing w:after="120" w:line="312" w:lineRule="auto"/>
         <w:rPr>
           <w:rFonts w:cs="Times New Roman"/>
@@ -8843,6 +8957,10 @@
     <w:p>
       <w:pPr>
         <w:pStyle w:val="ListBullet"/>
+        <w:numPr>
+          <w:ilvl w:val="0"/>
+          <w:numId w:val="7"/>
+        </w:numPr>
         <w:spacing w:after="120" w:line="312" w:lineRule="auto"/>
         <w:rPr>
           <w:rFonts w:cs="Times New Roman"/>
@@ -9033,16 +9151,7 @@
                 <w:sz w:val="24"/>
                 <w:szCs w:val="24"/>
               </w:rPr>
-              <w:t xml:space="preserve">Hồi quy (dự đoán </w:t>
-            </w:r>
-            <w:r>
-              <w:rPr>
-                <w:rFonts w:ascii="Times New Roman" w:hAnsi="Times New Roman" w:cs="Times New Roman"/>
-                <w:sz w:val="24"/>
-                <w:szCs w:val="24"/>
-              </w:rPr>
-              <w:lastRenderedPageBreak/>
-              <w:t>TotalAmount)</w:t>
+              <w:t>Hồi quy (dự đoán giá sản phẩm Price)</w:t>
             </w:r>
           </w:p>
         </w:tc>
@@ -9072,8 +9181,7 @@
                 <w:sz w:val="24"/>
                 <w:szCs w:val="24"/>
               </w:rPr>
-              <w:lastRenderedPageBreak/>
-              <w:t>Decision Tree Regressor</w:t>
+              <w:t>Linear Regression</w:t>
             </w:r>
           </w:p>
         </w:tc>
@@ -9103,16 +9211,7 @@
                 <w:sz w:val="24"/>
                 <w:szCs w:val="24"/>
               </w:rPr>
-              <w:t xml:space="preserve">RMSE 29.716 VND, R² = </w:t>
-            </w:r>
-            <w:r>
-              <w:rPr>
-                <w:rFonts w:ascii="Times New Roman" w:hAnsi="Times New Roman" w:cs="Times New Roman"/>
-                <w:sz w:val="24"/>
-                <w:szCs w:val="24"/>
-              </w:rPr>
-              <w:lastRenderedPageBreak/>
-              <w:t>0,977</w:t>
+              <w:t>RMSE 48.444 VND, R² = 0,369</w:t>
             </w:r>
           </w:p>
         </w:tc>
@@ -9146,7 +9245,6 @@
                 <w:sz w:val="24"/>
                 <w:szCs w:val="24"/>
               </w:rPr>
-              <w:lastRenderedPageBreak/>
               <w:t>Phân loại (đơn giá trị cao)</w:t>
             </w:r>
           </w:p>
@@ -9235,7 +9333,7 @@
           <w:sz w:val="24"/>
           <w:szCs w:val="24"/>
         </w:rPr>
-        <w:t>Hai mô hình thắng được lưu lại bằng joblib (regression_model.pkl và classification_model.pkl) để dùng cho giao diện web ở Task 5.</w:t>
+        <w:t>Hai mô hình thắng được lưu lại bằng joblib (regression_model.pkl và classification_model.pkl) để dùng cho giao diện web ở Task 5. Mô hình hồi quy được lưu dưới dạng Pipeline nên khi dự đoán chỉ cần đưa vào Category, Brand và Rating.</w:t>
       </w:r>
     </w:p>
     <w:p>
@@ -9274,7 +9372,7 @@
           <w:sz w:val="24"/>
           <w:szCs w:val="24"/>
         </w:rPr>
-        <w:t>Điểm hồi quy cao một phần do công thức có sẵn.</w:t>
+        <w:t>Mô hình hồi quy chỉ ở mức trung bình.</w:t>
       </w:r>
       <w:r>
         <w:rPr>
@@ -9283,7 +9381,7 @@
           <w:sz w:val="24"/>
           <w:szCs w:val="24"/>
         </w:rPr>
-        <w:t xml:space="preserve"> Vì TotalAmount = UnitPrice × Quantity, Decision Tree về cơ bản đang học lại phép nhân này, chứ không phải "dự đoán hành vi khách hàng".</w:t>
+        <w:t xml:space="preserve"> R² khoảng 0,37 và RMSE khoảng 48.400 VND so với giá trung bình khoảng 93.500 VND. Loại sản phẩm và thương hiệu chỉ giải thích được một phần giá, Rating gần như không liên quan, và dữ liệu thiếu các thông tin quyết định giá như dung tích, trọng lượng, quy cách đóng gói. Kết quả chỉ nên dùng làm giá tham khảo.</w:t>
       </w:r>
     </w:p>
     <w:p>
@@ -9305,7 +9403,7 @@
           <w:sz w:val="24"/>
           <w:szCs w:val="24"/>
         </w:rPr>
-        <w:t>Mô hình phân loại chưa thật mạnh.</w:t>
+        <w:t>Dữ liệu hồi quy rất ít và có overfitting.</w:t>
       </w:r>
       <w:r>
         <w:rPr>
@@ -9314,7 +9412,7 @@
           <w:sz w:val="24"/>
           <w:szCs w:val="24"/>
         </w:rPr>
-        <w:t xml:space="preserve"> Các thông tin khách hàng (tuổi, giới tính, thành phố, thanh toán) gần như không liên quan đến giá trị đơn, nên sức dự đoán chủ yếu đến từ Quantity và Category.</w:t>
+        <w:t xml:space="preserve"> Chỉ có 392 sản phẩm (79 sản phẩm test) nên kết quả dao động giữa các lần chia; Linear Regression có R² Train 0,83 so với Test 0,37 do số cột One-Hot quá nhiều so với số sản phẩm. Mô hình cũng dự đoán kém hơn ở nhóm sản phẩm giá cao.</w:t>
       </w:r>
     </w:p>
     <w:p>
@@ -9336,7 +9434,7 @@
           <w:sz w:val="24"/>
           <w:szCs w:val="24"/>
         </w:rPr>
-        <w:t>Đơn giá trị rất lớn dễ sai hơn</w:t>
+        <w:t>Mô hình phân loại chưa thật mạnh.</w:t>
       </w:r>
       <w:r>
         <w:rPr>
@@ -9345,7 +9443,7 @@
           <w:sz w:val="24"/>
           <w:szCs w:val="24"/>
         </w:rPr>
-        <w:t xml:space="preserve"> (đặc biệt trên khoảng 400 nghìn VND) vì có ít mẫu.</w:t>
+        <w:t xml:space="preserve"> Các thông tin khách hàng (tuổi, giới tính, thành phố, thanh toán) gần như không liên quan đến giá trị đơn, nên sức dự đoán chủ yếu đến từ Quantity và Category. Đơn giá trị rất lớn (trên khoảng 400 nghìn VND) dễ sai hơn vì có ít mẫu.</w:t>
       </w:r>
     </w:p>
     <w:p>
@@ -9367,6 +9465,7 @@
           <w:sz w:val="24"/>
           <w:szCs w:val="24"/>
         </w:rPr>
+        <w:lastRenderedPageBreak/>
         <w:t>Dữ liệu chỉ gồm 1.000 đơn mô phỏng</w:t>
       </w:r>
       <w:r>
@@ -9532,6 +9631,7 @@
               <w:bottom w:w="60" w:type="dxa"/>
               <w:right w:w="100" w:type="dxa"/>
             </w:tcMar>
+            <w:hideMark/>
           </w:tcPr>
           <w:p>
             <w:pPr>
@@ -9567,6 +9667,7 @@
               <w:bottom w:w="60" w:type="dxa"/>
               <w:right w:w="100" w:type="dxa"/>
             </w:tcMar>
+            <w:hideMark/>
           </w:tcPr>
           <w:p>
             <w:pPr>
@@ -9602,6 +9703,7 @@
               <w:bottom w:w="60" w:type="dxa"/>
               <w:right w:w="100" w:type="dxa"/>
             </w:tcMar>
+            <w:hideMark/>
           </w:tcPr>
           <w:p>
             <w:pPr>
@@ -9638,6 +9740,7 @@
               <w:bottom w:w="60" w:type="dxa"/>
               <w:right w:w="100" w:type="dxa"/>
             </w:tcMar>
+            <w:hideMark/>
           </w:tcPr>
           <w:p>
             <w:pPr>
@@ -9670,20 +9773,21 @@
               <w:bottom w:w="60" w:type="dxa"/>
               <w:right w:w="100" w:type="dxa"/>
             </w:tcMar>
-          </w:tcPr>
-          <w:p>
-            <w:pPr>
-              <w:rPr>
-                <w:sz w:val="24"/>
-                <w:szCs w:val="24"/>
-              </w:rPr>
-            </w:pPr>
-            <w:r>
-              <w:rPr>
-                <w:sz w:val="24"/>
-                <w:szCs w:val="24"/>
-              </w:rPr>
-              <w:t>Nhập thông tin đơn hàng → dự đoán tổng tiền và đơn thường / đơn giá trị cao</w:t>
+            <w:hideMark/>
+          </w:tcPr>
+          <w:p>
+            <w:pPr>
+              <w:rPr>
+                <w:sz w:val="24"/>
+                <w:szCs w:val="24"/>
+              </w:rPr>
+            </w:pPr>
+            <w:r>
+              <w:rPr>
+                <w:sz w:val="24"/>
+                <w:szCs w:val="24"/>
+              </w:rPr>
+              <w:t>Nhập thông tin đơn hàng → dự đoán giá sản phẩm và phân loại đơn thường / đơn giá trị cao</w:t>
             </w:r>
           </w:p>
         </w:tc>
@@ -9702,6 +9806,7 @@
               <w:bottom w:w="60" w:type="dxa"/>
               <w:right w:w="100" w:type="dxa"/>
             </w:tcMar>
+            <w:hideMark/>
           </w:tcPr>
           <w:p>
             <w:pPr>
@@ -9736,6 +9841,7 @@
               <w:bottom w:w="60" w:type="dxa"/>
               <w:right w:w="100" w:type="dxa"/>
             </w:tcMar>
+            <w:hideMark/>
           </w:tcPr>
           <w:p>
             <w:pPr>
@@ -9768,20 +9874,21 @@
               <w:bottom w:w="60" w:type="dxa"/>
               <w:right w:w="100" w:type="dxa"/>
             </w:tcMar>
-          </w:tcPr>
-          <w:p>
-            <w:pPr>
-              <w:rPr>
-                <w:sz w:val="24"/>
-                <w:szCs w:val="24"/>
-              </w:rPr>
-            </w:pPr>
-            <w:r>
-              <w:rPr>
-                <w:sz w:val="24"/>
-                <w:szCs w:val="24"/>
-              </w:rPr>
-              <w:t>Nhập thống kê của 1 khách → cho biết khách thuộc cụm nào</w:t>
+            <w:hideMark/>
+          </w:tcPr>
+          <w:p>
+            <w:pPr>
+              <w:rPr>
+                <w:sz w:val="24"/>
+                <w:szCs w:val="24"/>
+              </w:rPr>
+            </w:pPr>
+            <w:r>
+              <w:rPr>
+                <w:sz w:val="24"/>
+                <w:szCs w:val="24"/>
+              </w:rPr>
+              <w:t>Nhập thống kê của 1 khách → cho biết khách thuộc cụm nào, kèm bảng so sánh đặc điểm các cụm</w:t>
             </w:r>
           </w:p>
         </w:tc>
@@ -9800,6 +9907,7 @@
               <w:bottom w:w="60" w:type="dxa"/>
               <w:right w:w="100" w:type="dxa"/>
             </w:tcMar>
+            <w:hideMark/>
           </w:tcPr>
           <w:p>
             <w:pPr>
@@ -9834,6 +9942,7 @@
               <w:bottom w:w="60" w:type="dxa"/>
               <w:right w:w="100" w:type="dxa"/>
             </w:tcMar>
+            <w:hideMark/>
           </w:tcPr>
           <w:p>
             <w:pPr>
@@ -9866,6 +9975,7 @@
               <w:bottom w:w="60" w:type="dxa"/>
               <w:right w:w="100" w:type="dxa"/>
             </w:tcMar>
+            <w:hideMark/>
           </w:tcPr>
           <w:p>
             <w:pPr>
@@ -9898,6 +10008,7 @@
               <w:bottom w:w="60" w:type="dxa"/>
               <w:right w:w="100" w:type="dxa"/>
             </w:tcMar>
+            <w:hideMark/>
           </w:tcPr>
           <w:p>
             <w:pPr>
@@ -9932,6 +10043,7 @@
               <w:bottom w:w="60" w:type="dxa"/>
               <w:right w:w="100" w:type="dxa"/>
             </w:tcMar>
+            <w:hideMark/>
           </w:tcPr>
           <w:p>
             <w:pPr>
@@ -9964,6 +10076,7 @@
               <w:bottom w:w="60" w:type="dxa"/>
               <w:right w:w="100" w:type="dxa"/>
             </w:tcMar>
+            <w:hideMark/>
           </w:tcPr>
           <w:p>
             <w:pPr>
@@ -9996,6 +10109,7 @@
               <w:bottom w:w="60" w:type="dxa"/>
               <w:right w:w="100" w:type="dxa"/>
             </w:tcMar>
+            <w:hideMark/>
           </w:tcPr>
           <w:p>
             <w:pPr>
@@ -10065,7 +10179,7 @@
         <w:pStyle w:val="ListParagraph"/>
         <w:numPr>
           <w:ilvl w:val="0"/>
-          <w:numId w:val="6"/>
+          <w:numId w:val="10"/>
         </w:numPr>
         <w:spacing w:after="60"/>
         <w:rPr>
@@ -10078,7 +10192,7 @@
           <w:sz w:val="24"/>
           <w:szCs w:val="24"/>
         </w:rPr>
-        <w:t>Người dùng nhập: tuổi, đơn giá, số lượng, điểm đánh giá (thanh trượt / ô số) và chọn giới tính, thành phố, phương thức thanh toán, nhóm sản phẩm (dropdown).</w:t>
+        <w:t>Người dùng nhập: tuổi, số lượng, điểm đánh giá (thanh trượt) và chọn giới tính, nhóm sản phẩm, thương hiệu, thành phố, phương thức thanh toán (dropdown). Ứng dụng không còn ô nhập đơn giá.</w:t>
       </w:r>
     </w:p>
     <w:p>
@@ -10086,7 +10200,7 @@
         <w:pStyle w:val="ListParagraph"/>
         <w:numPr>
           <w:ilvl w:val="0"/>
-          <w:numId w:val="6"/>
+          <w:numId w:val="10"/>
         </w:numPr>
         <w:spacing w:after="60"/>
         <w:rPr>
@@ -10104,7 +10218,6 @@
       <w:r>
         <w:rPr>
           <w:b/>
-          <w:bCs/>
           <w:sz w:val="24"/>
           <w:szCs w:val="24"/>
         </w:rPr>
@@ -10115,7 +10228,7 @@
           <w:sz w:val="24"/>
           <w:szCs w:val="24"/>
         </w:rPr>
-        <w:t xml:space="preserve"> để xem 3 kết quả: tổng tiền dự đoán (VND), phân loại đơn (thường / giá trị cao) và xác suất là đơn giá trị cao.</w:t>
+        <w:t xml:space="preserve"> để xem 3 kết quả: giá sản phẩm dự đoán (VND) từ mô hình Regression (dùng nhóm sản phẩm, thương hiệu và điểm đánh giá), phân loại đơn (thường / giá trị cao) và xác suất là đơn giá trị cao từ mô hình Classification. Hai mô hình độc lập với nhau, và giá dự đoán kèm ghi chú sai số RMSE khoảng 48.444 VND nên chỉ mang tính tham khảo.</w:t>
       </w:r>
     </w:p>
     <w:p>
@@ -10123,7 +10236,7 @@
         <w:pStyle w:val="ListParagraph"/>
         <w:numPr>
           <w:ilvl w:val="0"/>
-          <w:numId w:val="6"/>
+          <w:numId w:val="10"/>
         </w:numPr>
         <w:spacing w:after="60"/>
         <w:rPr>
@@ -10136,7 +10249,6 @@
           <w:sz w:val="24"/>
           <w:szCs w:val="24"/>
         </w:rPr>
-        <w:lastRenderedPageBreak/>
         <w:t xml:space="preserve">Ngưỡng đơn giá trị cao là </w:t>
       </w:r>
       <w:r>
@@ -10167,15 +10279,16 @@
       </w:pPr>
       <w:r>
         <w:rPr>
-          <w:noProof/>
-          <w:sz w:val="24"/>
-          <w:szCs w:val="24"/>
-        </w:rPr>
+          <w:sz w:val="24"/>
+          <w:szCs w:val="24"/>
+          <w:lang w:val="vi-VN"/>
+        </w:rPr>
+        <w:lastRenderedPageBreak/>
         <w:drawing>
-          <wp:inline distT="0" distB="0" distL="0" distR="0" wp14:anchorId="32862520" wp14:editId="5F4B0741">
-            <wp:extent cx="5731510" cy="2603500"/>
-            <wp:effectExtent l="0" t="0" r="2540" b="6350"/>
-            <wp:docPr id="888124312" name="Picture 1"/>
+          <wp:inline distT="0" distB="0" distL="0" distR="0" wp14:anchorId="3D9464FB" wp14:editId="7D88D52B">
+            <wp:extent cx="5731510" cy="2628779"/>
+            <wp:effectExtent l="0" t="0" r="2540" b="635"/>
+            <wp:docPr id="1" name="Picture 1"/>
             <wp:cNvGraphicFramePr>
               <a:graphicFrameLocks xmlns:a="http://schemas.openxmlformats.org/drawingml/2006/main" noChangeAspect="1"/>
             </wp:cNvGraphicFramePr>
@@ -10183,7 +10296,7 @@
               <a:graphicData uri="http://schemas.openxmlformats.org/drawingml/2006/picture">
                 <pic:pic xmlns:pic="http://schemas.openxmlformats.org/drawingml/2006/picture">
                   <pic:nvPicPr>
-                    <pic:cNvPr id="888124312" name=""/>
+                    <pic:cNvPr id="0" name=""/>
                     <pic:cNvPicPr/>
                   </pic:nvPicPr>
                   <pic:blipFill>
@@ -10195,7 +10308,7 @@
                   <pic:spPr>
                     <a:xfrm>
                       <a:off x="0" y="0"/>
-                      <a:ext cx="5731510" cy="2603500"/>
+                      <a:ext cx="5731510" cy="2628779"/>
                     </a:xfrm>
                     <a:prstGeom prst="rect">
                       <a:avLst/>
@@ -10207,6 +10320,8 @@
           </wp:inline>
         </w:drawing>
       </w:r>
+      <w:bookmarkStart w:id="0" w:name="_GoBack"/>
+      <w:bookmarkEnd w:id="0"/>
     </w:p>
     <w:p>
       <w:pPr>
@@ -10231,7 +10346,7 @@
         <w:pStyle w:val="ListParagraph"/>
         <w:numPr>
           <w:ilvl w:val="0"/>
-          <w:numId w:val="6"/>
+          <w:numId w:val="10"/>
         </w:numPr>
         <w:spacing w:after="60"/>
         <w:rPr>
@@ -10252,7 +10367,7 @@
         <w:pStyle w:val="ListParagraph"/>
         <w:numPr>
           <w:ilvl w:val="0"/>
-          <w:numId w:val="6"/>
+          <w:numId w:val="10"/>
         </w:numPr>
         <w:spacing w:after="60"/>
         <w:rPr>
@@ -10265,39 +10380,7 @@
           <w:sz w:val="24"/>
           <w:szCs w:val="24"/>
         </w:rPr>
-        <w:t xml:space="preserve">Ứng dụng chuẩn hóa → PCA → K-Means rồi báo khách thuộc </w:t>
-      </w:r>
-      <w:r>
-        <w:rPr>
-          <w:b/>
-          <w:bCs/>
-          <w:sz w:val="24"/>
-          <w:szCs w:val="24"/>
-        </w:rPr>
-        <w:t>Cụm 0</w:t>
-      </w:r>
-      <w:r>
-        <w:rPr>
-          <w:sz w:val="24"/>
-          <w:szCs w:val="24"/>
-        </w:rPr>
-        <w:t xml:space="preserve"> hay </w:t>
-      </w:r>
-      <w:r>
-        <w:rPr>
-          <w:b/>
-          <w:bCs/>
-          <w:sz w:val="24"/>
-          <w:szCs w:val="24"/>
-        </w:rPr>
-        <w:t>Cụm 1</w:t>
-      </w:r>
-      <w:r>
-        <w:rPr>
-          <w:sz w:val="24"/>
-          <w:szCs w:val="24"/>
-        </w:rPr>
-        <w:t>.</w:t>
+        <w:t>Ứng dụng chuẩn hóa → PCA → K-Means rồi báo khách thuộc Cụm 0 hay Cụm 1, kèm tên cụm (đặt theo tổng chi tiêu trung bình: chi tiêu thấp / chi tiêu cao), đặc điểm trung bình và số khách của cụm. Bên dưới có bảng so sánh các cụm.</w:t>
       </w:r>
     </w:p>
     <w:p>
@@ -10311,15 +10394,15 @@
       <w:r>
         <w:rPr>
           <w:b/>
-          <w:bCs/>
+          <w:noProof/>
           <w:sz w:val="24"/>
           <w:szCs w:val="24"/>
         </w:rPr>
         <w:drawing>
-          <wp:inline distT="0" distB="0" distL="0" distR="0" wp14:anchorId="7FC74630" wp14:editId="2457FC27">
-            <wp:extent cx="5731510" cy="2364248"/>
-            <wp:effectExtent l="0" t="0" r="2540" b="0"/>
-            <wp:docPr id="5" name="Picture 5"/>
+          <wp:inline distT="0" distB="0" distL="0" distR="0">
+            <wp:extent cx="5727700" cy="2363470"/>
+            <wp:effectExtent l="0" t="0" r="6350" b="0"/>
+            <wp:docPr id="10" name="Picture 10"/>
             <wp:cNvGraphicFramePr>
               <a:graphicFrameLocks xmlns:a="http://schemas.openxmlformats.org/drawingml/2006/main" noChangeAspect="1"/>
             </wp:cNvGraphicFramePr>
@@ -10327,23 +10410,36 @@
               <a:graphicData uri="http://schemas.openxmlformats.org/drawingml/2006/picture">
                 <pic:pic xmlns:pic="http://schemas.openxmlformats.org/drawingml/2006/picture">
                   <pic:nvPicPr>
-                    <pic:cNvPr id="0" name=""/>
-                    <pic:cNvPicPr/>
+                    <pic:cNvPr id="0" name="Picture 5"/>
+                    <pic:cNvPicPr>
+                      <a:picLocks noChangeAspect="1" noChangeArrowheads="1"/>
+                    </pic:cNvPicPr>
                   </pic:nvPicPr>
                   <pic:blipFill>
-                    <a:blip r:embed="rId12"/>
+                    <a:blip r:embed="rId12" cstate="print">
+                      <a:extLst>
+                        <a:ext uri="{28A0092B-C50C-407E-A947-70E740481C1C}">
+                          <a14:useLocalDpi xmlns:a14="http://schemas.microsoft.com/office/drawing/2010/main" val="0"/>
+                        </a:ext>
+                      </a:extLst>
+                    </a:blip>
+                    <a:srcRect/>
                     <a:stretch>
                       <a:fillRect/>
                     </a:stretch>
                   </pic:blipFill>
-                  <pic:spPr>
+                  <pic:spPr bwMode="auto">
                     <a:xfrm>
                       <a:off x="0" y="0"/>
-                      <a:ext cx="5731510" cy="2364248"/>
+                      <a:ext cx="5727700" cy="2363470"/>
                     </a:xfrm>
                     <a:prstGeom prst="rect">
                       <a:avLst/>
                     </a:prstGeom>
+                    <a:noFill/>
+                    <a:ln>
+                      <a:noFill/>
+                    </a:ln>
                   </pic:spPr>
                 </pic:pic>
               </a:graphicData>
@@ -10366,7 +10462,7 @@
         <w:pStyle w:val="ListParagraph"/>
         <w:numPr>
           <w:ilvl w:val="0"/>
-          <w:numId w:val="6"/>
+          <w:numId w:val="10"/>
         </w:numPr>
         <w:spacing w:after="60"/>
         <w:rPr>
@@ -10379,7 +10475,7 @@
           <w:sz w:val="24"/>
           <w:szCs w:val="24"/>
         </w:rPr>
-        <w:t>Mỗi điểm là một khách hàng, hai màu là hai cụm.</w:t>
+        <w:t>Mỗi điểm là một khách hàng, hai màu là hai cụm; chú thích ghi cả tên cụm. Dưới biểu đồ hiển thị số khách hàng, số thành phần PCA và phần phương sai được giữ lại.</w:t>
       </w:r>
     </w:p>
     <w:p>
@@ -10396,10 +10492,10 @@
         </w:rPr>
         <w:lastRenderedPageBreak/>
         <w:drawing>
-          <wp:inline distT="0" distB="0" distL="0" distR="0" wp14:anchorId="35FB2A65" wp14:editId="38D87EA5">
-            <wp:extent cx="5731510" cy="3223974"/>
-            <wp:effectExtent l="0" t="0" r="2540" b="0"/>
-            <wp:docPr id="6" name="Picture 6"/>
+          <wp:inline distT="0" distB="0" distL="0" distR="0">
+            <wp:extent cx="5727700" cy="3217545"/>
+            <wp:effectExtent l="0" t="0" r="6350" b="1905"/>
+            <wp:docPr id="9" name="Picture 9"/>
             <wp:cNvGraphicFramePr>
               <a:graphicFrameLocks xmlns:a="http://schemas.openxmlformats.org/drawingml/2006/main" noChangeAspect="1"/>
             </wp:cNvGraphicFramePr>
@@ -10407,23 +10503,36 @@
               <a:graphicData uri="http://schemas.openxmlformats.org/drawingml/2006/picture">
                 <pic:pic xmlns:pic="http://schemas.openxmlformats.org/drawingml/2006/picture">
                   <pic:nvPicPr>
-                    <pic:cNvPr id="0" name=""/>
-                    <pic:cNvPicPr/>
+                    <pic:cNvPr id="0" name="Picture 6"/>
+                    <pic:cNvPicPr>
+                      <a:picLocks noChangeAspect="1" noChangeArrowheads="1"/>
+                    </pic:cNvPicPr>
                   </pic:nvPicPr>
                   <pic:blipFill>
-                    <a:blip r:embed="rId13"/>
+                    <a:blip r:embed="rId13" cstate="print">
+                      <a:extLst>
+                        <a:ext uri="{28A0092B-C50C-407E-A947-70E740481C1C}">
+                          <a14:useLocalDpi xmlns:a14="http://schemas.microsoft.com/office/drawing/2010/main" val="0"/>
+                        </a:ext>
+                      </a:extLst>
+                    </a:blip>
+                    <a:srcRect/>
                     <a:stretch>
                       <a:fillRect/>
                     </a:stretch>
                   </pic:blipFill>
-                  <pic:spPr>
+                  <pic:spPr bwMode="auto">
                     <a:xfrm>
                       <a:off x="0" y="0"/>
-                      <a:ext cx="5731510" cy="3223974"/>
+                      <a:ext cx="5727700" cy="3217545"/>
                     </a:xfrm>
                     <a:prstGeom prst="rect">
                       <a:avLst/>
                     </a:prstGeom>
+                    <a:noFill/>
+                    <a:ln>
+                      <a:noFill/>
+                    </a:ln>
                   </pic:spPr>
                 </pic:pic>
               </a:graphicData>
@@ -10455,10 +10564,10 @@
           <w:noProof/>
         </w:rPr>
         <w:drawing>
-          <wp:inline distT="0" distB="0" distL="0" distR="0" wp14:anchorId="13616F9F" wp14:editId="7E17F465">
-            <wp:extent cx="5731510" cy="3223974"/>
-            <wp:effectExtent l="0" t="0" r="2540" b="0"/>
-            <wp:docPr id="7" name="Picture 7"/>
+          <wp:inline distT="0" distB="0" distL="0" distR="0">
+            <wp:extent cx="5727700" cy="3217545"/>
+            <wp:effectExtent l="0" t="0" r="6350" b="1905"/>
+            <wp:docPr id="8" name="Picture 8"/>
             <wp:cNvGraphicFramePr>
               <a:graphicFrameLocks xmlns:a="http://schemas.openxmlformats.org/drawingml/2006/main" noChangeAspect="1"/>
             </wp:cNvGraphicFramePr>
@@ -10466,23 +10575,36 @@
               <a:graphicData uri="http://schemas.openxmlformats.org/drawingml/2006/picture">
                 <pic:pic xmlns:pic="http://schemas.openxmlformats.org/drawingml/2006/picture">
                   <pic:nvPicPr>
-                    <pic:cNvPr id="0" name=""/>
-                    <pic:cNvPicPr/>
+                    <pic:cNvPr id="0" name="Picture 7"/>
+                    <pic:cNvPicPr>
+                      <a:picLocks noChangeAspect="1" noChangeArrowheads="1"/>
+                    </pic:cNvPicPr>
                   </pic:nvPicPr>
                   <pic:blipFill>
-                    <a:blip r:embed="rId14"/>
+                    <a:blip r:embed="rId14" cstate="print">
+                      <a:extLst>
+                        <a:ext uri="{28A0092B-C50C-407E-A947-70E740481C1C}">
+                          <a14:useLocalDpi xmlns:a14="http://schemas.microsoft.com/office/drawing/2010/main" val="0"/>
+                        </a:ext>
+                      </a:extLst>
+                    </a:blip>
+                    <a:srcRect/>
                     <a:stretch>
                       <a:fillRect/>
                     </a:stretch>
                   </pic:blipFill>
-                  <pic:spPr>
+                  <pic:spPr bwMode="auto">
                     <a:xfrm>
                       <a:off x="0" y="0"/>
-                      <a:ext cx="5731510" cy="3223974"/>
+                      <a:ext cx="5727700" cy="3217545"/>
                     </a:xfrm>
                     <a:prstGeom prst="rect">
                       <a:avLst/>
                     </a:prstGeom>
+                    <a:noFill/>
+                    <a:ln>
+                      <a:noFill/>
+                    </a:ln>
                   </pic:spPr>
                 </pic:pic>
               </a:graphicData>
@@ -10490,8 +10612,6 @@
           </wp:inline>
         </w:drawing>
       </w:r>
-      <w:bookmarkStart w:id="0" w:name="_GoBack"/>
-      <w:bookmarkEnd w:id="0"/>
       <w:r>
         <w:rPr>
           <w:color w:val="auto"/>
@@ -10514,12 +10634,11 @@
           <w:sz w:val="24"/>
           <w:szCs w:val="24"/>
         </w:rPr>
-        <w:t xml:space="preserve">Nhóm chạy thử với một khách nữ, 30 tuổi, ở TP.HCM, thanh toán COD, mua </w:t>
+        <w:t xml:space="preserve">Nhóm chạy thử với một khách nữ, 30 tuổi, ở TP.HCM, thanh toán COD, mua sản phẩm nhóm </w:t>
       </w:r>
       <w:r>
         <w:rPr>
           <w:b/>
-          <w:bCs/>
           <w:sz w:val="24"/>
           <w:szCs w:val="24"/>
         </w:rPr>
@@ -10530,7 +10649,7 @@
           <w:sz w:val="24"/>
           <w:szCs w:val="24"/>
         </w:rPr>
-        <w:t xml:space="preserve"> (đơn giá 90.000 VND, đánh giá 4,75), chỉ thay đổi số lượng:</w:t>
+        <w:t xml:space="preserve"> (đánh giá 4,75), chỉ thay đổi số lượng. Vì mô hình phân loại dùng số lượng và nhóm sản phẩm (không dùng đơn giá), xác suất đơn giá trị cao thay đổi theo số lượng:</w:t>
       </w:r>
     </w:p>
     <w:tbl>
@@ -10551,9 +10670,8 @@
         <w:tblLook w:val="04A0" w:firstRow="1" w:lastRow="0" w:firstColumn="1" w:lastColumn="0" w:noHBand="0" w:noVBand="1"/>
       </w:tblPr>
       <w:tblGrid>
-        <w:gridCol w:w="2000"/>
-        <w:gridCol w:w="3513"/>
-        <w:gridCol w:w="3513"/>
+        <w:gridCol w:w="3274"/>
+        <w:gridCol w:w="5752"/>
       </w:tblGrid>
       <w:tr>
         <w:trPr>
@@ -10575,6 +10693,7 @@
               <w:bottom w:w="60" w:type="dxa"/>
               <w:right w:w="100" w:type="dxa"/>
             </w:tcMar>
+            <w:hideMark/>
           </w:tcPr>
           <w:p>
             <w:pPr>
@@ -10610,6 +10729,7 @@
               <w:bottom w:w="60" w:type="dxa"/>
               <w:right w:w="100" w:type="dxa"/>
             </w:tcMar>
+            <w:hideMark/>
           </w:tcPr>
           <w:p>
             <w:pPr>
@@ -10625,41 +10745,6 @@
                 <w:sz w:val="24"/>
                 <w:szCs w:val="24"/>
               </w:rPr>
-              <w:t>Tổng tiền dự đoán</w:t>
-            </w:r>
-          </w:p>
-        </w:tc>
-        <w:tc>
-          <w:tcPr>
-            <w:tcW w:w="3513" w:type="dxa"/>
-            <w:tcBorders>
-              <w:top w:val="single" w:sz="4" w:space="0" w:color="999999"/>
-              <w:left w:val="single" w:sz="4" w:space="0" w:color="999999"/>
-              <w:bottom w:val="single" w:sz="4" w:space="0" w:color="999999"/>
-              <w:right w:val="single" w:sz="4" w:space="0" w:color="999999"/>
-            </w:tcBorders>
-            <w:shd w:val="clear" w:color="auto" w:fill="D9E2F3"/>
-            <w:tcMar>
-              <w:top w:w="60" w:type="dxa"/>
-              <w:left w:w="100" w:type="dxa"/>
-              <w:bottom w:w="60" w:type="dxa"/>
-              <w:right w:w="100" w:type="dxa"/>
-            </w:tcMar>
-          </w:tcPr>
-          <w:p>
-            <w:pPr>
-              <w:rPr>
-                <w:sz w:val="24"/>
-                <w:szCs w:val="24"/>
-              </w:rPr>
-            </w:pPr>
-            <w:r>
-              <w:rPr>
-                <w:b/>
-                <w:bCs/>
-                <w:sz w:val="24"/>
-                <w:szCs w:val="24"/>
-              </w:rPr>
               <w:t>Xác suất là đơn giá trị cao</w:t>
             </w:r>
           </w:p>
@@ -10681,6 +10766,7 @@
               <w:bottom w:w="60" w:type="dxa"/>
               <w:right w:w="100" w:type="dxa"/>
             </w:tcMar>
+            <w:hideMark/>
           </w:tcPr>
           <w:p>
             <w:pPr>
@@ -10713,38 +10799,7 @@
               <w:bottom w:w="60" w:type="dxa"/>
               <w:right w:w="100" w:type="dxa"/>
             </w:tcMar>
-          </w:tcPr>
-          <w:p>
-            <w:pPr>
-              <w:rPr>
-                <w:sz w:val="24"/>
-                <w:szCs w:val="24"/>
-              </w:rPr>
-            </w:pPr>
-            <w:r>
-              <w:rPr>
-                <w:sz w:val="24"/>
-                <w:szCs w:val="24"/>
-              </w:rPr>
-              <w:t>≈ 90.700 VND</w:t>
-            </w:r>
-          </w:p>
-        </w:tc>
-        <w:tc>
-          <w:tcPr>
-            <w:tcW w:w="3513" w:type="dxa"/>
-            <w:tcBorders>
-              <w:top w:val="single" w:sz="4" w:space="0" w:color="999999"/>
-              <w:left w:val="single" w:sz="4" w:space="0" w:color="999999"/>
-              <w:bottom w:val="single" w:sz="4" w:space="0" w:color="999999"/>
-              <w:right w:val="single" w:sz="4" w:space="0" w:color="999999"/>
-            </w:tcBorders>
-            <w:tcMar>
-              <w:top w:w="60" w:type="dxa"/>
-              <w:left w:w="100" w:type="dxa"/>
-              <w:bottom w:w="60" w:type="dxa"/>
-              <w:right w:w="100" w:type="dxa"/>
-            </w:tcMar>
+            <w:hideMark/>
           </w:tcPr>
           <w:p>
             <w:pPr>
@@ -10779,6 +10834,7 @@
               <w:bottom w:w="60" w:type="dxa"/>
               <w:right w:w="100" w:type="dxa"/>
             </w:tcMar>
+            <w:hideMark/>
           </w:tcPr>
           <w:p>
             <w:pPr>
@@ -10811,38 +10867,7 @@
               <w:bottom w:w="60" w:type="dxa"/>
               <w:right w:w="100" w:type="dxa"/>
             </w:tcMar>
-          </w:tcPr>
-          <w:p>
-            <w:pPr>
-              <w:rPr>
-                <w:sz w:val="24"/>
-                <w:szCs w:val="24"/>
-              </w:rPr>
-            </w:pPr>
-            <w:r>
-              <w:rPr>
-                <w:sz w:val="24"/>
-                <w:szCs w:val="24"/>
-              </w:rPr>
-              <w:t>≈ 178.200 VND</w:t>
-            </w:r>
-          </w:p>
-        </w:tc>
-        <w:tc>
-          <w:tcPr>
-            <w:tcW w:w="3513" w:type="dxa"/>
-            <w:tcBorders>
-              <w:top w:val="single" w:sz="4" w:space="0" w:color="999999"/>
-              <w:left w:val="single" w:sz="4" w:space="0" w:color="999999"/>
-              <w:bottom w:val="single" w:sz="4" w:space="0" w:color="999999"/>
-              <w:right w:val="single" w:sz="4" w:space="0" w:color="999999"/>
-            </w:tcBorders>
-            <w:tcMar>
-              <w:top w:w="60" w:type="dxa"/>
-              <w:left w:w="100" w:type="dxa"/>
-              <w:bottom w:w="60" w:type="dxa"/>
-              <w:right w:w="100" w:type="dxa"/>
-            </w:tcMar>
+            <w:hideMark/>
           </w:tcPr>
           <w:p>
             <w:pPr>
@@ -10877,6 +10902,7 @@
               <w:bottom w:w="60" w:type="dxa"/>
               <w:right w:w="100" w:type="dxa"/>
             </w:tcMar>
+            <w:hideMark/>
           </w:tcPr>
           <w:p>
             <w:pPr>
@@ -10909,38 +10935,7 @@
               <w:bottom w:w="60" w:type="dxa"/>
               <w:right w:w="100" w:type="dxa"/>
             </w:tcMar>
-          </w:tcPr>
-          <w:p>
-            <w:pPr>
-              <w:rPr>
-                <w:sz w:val="24"/>
-                <w:szCs w:val="24"/>
-              </w:rPr>
-            </w:pPr>
-            <w:r>
-              <w:rPr>
-                <w:sz w:val="24"/>
-                <w:szCs w:val="24"/>
-              </w:rPr>
-              <w:t>≈ 265.800 VND</w:t>
-            </w:r>
-          </w:p>
-        </w:tc>
-        <w:tc>
-          <w:tcPr>
-            <w:tcW w:w="3513" w:type="dxa"/>
-            <w:tcBorders>
-              <w:top w:val="single" w:sz="4" w:space="0" w:color="999999"/>
-              <w:left w:val="single" w:sz="4" w:space="0" w:color="999999"/>
-              <w:bottom w:val="single" w:sz="4" w:space="0" w:color="999999"/>
-              <w:right w:val="single" w:sz="4" w:space="0" w:color="999999"/>
-            </w:tcBorders>
-            <w:tcMar>
-              <w:top w:w="60" w:type="dxa"/>
-              <w:left w:w="100" w:type="dxa"/>
-              <w:bottom w:w="60" w:type="dxa"/>
-              <w:right w:w="100" w:type="dxa"/>
-            </w:tcMar>
+            <w:hideMark/>
           </w:tcPr>
           <w:p>
             <w:pPr>
@@ -10983,7 +10978,7 @@
           <w:szCs w:val="24"/>
         </w:rPr>
         <w:lastRenderedPageBreak/>
-        <w:t>Khi tăng số lượng, cả tổng tiền và xác suất đơn giá trị cao đều tăng rõ rệt. Điều này hợp lý và khớp với dữ liệu thật (xem phần 3.4).</w:t>
+        <w:t>Khi tăng số lượng, xác suất đơn giá trị cao tăng rõ rệt. Điều này hợp lý và khớp với dữ liệu thật (xem phần 3.4). Phần giá sản phẩm do mô hình Regression dự đoán không phụ thuộc vào số lượng; ví dụ mô hình lưu trong notebook dự đoán sản phẩm Kem đánh răng, thương hiệu Colgate, Rating 4,8 có giá khoảng 67.315 VND.</w:t>
       </w:r>
     </w:p>
     <w:p>
@@ -11093,6 +11088,7 @@
               <w:bottom w:w="60" w:type="dxa"/>
               <w:right w:w="100" w:type="dxa"/>
             </w:tcMar>
+            <w:hideMark/>
           </w:tcPr>
           <w:p>
             <w:pPr>
@@ -11128,6 +11124,7 @@
               <w:bottom w:w="60" w:type="dxa"/>
               <w:right w:w="100" w:type="dxa"/>
             </w:tcMar>
+            <w:hideMark/>
           </w:tcPr>
           <w:p>
             <w:pPr>
@@ -11163,6 +11160,7 @@
               <w:bottom w:w="60" w:type="dxa"/>
               <w:right w:w="100" w:type="dxa"/>
             </w:tcMar>
+            <w:hideMark/>
           </w:tcPr>
           <w:p>
             <w:pPr>
@@ -11198,6 +11196,7 @@
               <w:bottom w:w="60" w:type="dxa"/>
               <w:right w:w="100" w:type="dxa"/>
             </w:tcMar>
+            <w:hideMark/>
           </w:tcPr>
           <w:p>
             <w:pPr>
@@ -11234,6 +11233,7 @@
               <w:bottom w:w="60" w:type="dxa"/>
               <w:right w:w="100" w:type="dxa"/>
             </w:tcMar>
+            <w:hideMark/>
           </w:tcPr>
           <w:p>
             <w:pPr>
@@ -11266,6 +11266,7 @@
               <w:bottom w:w="60" w:type="dxa"/>
               <w:right w:w="100" w:type="dxa"/>
             </w:tcMar>
+            <w:hideMark/>
           </w:tcPr>
           <w:p>
             <w:pPr>
@@ -11298,6 +11299,7 @@
               <w:bottom w:w="60" w:type="dxa"/>
               <w:right w:w="100" w:type="dxa"/>
             </w:tcMar>
+            <w:hideMark/>
           </w:tcPr>
           <w:p>
             <w:pPr>
@@ -11330,6 +11332,7 @@
               <w:bottom w:w="60" w:type="dxa"/>
               <w:right w:w="100" w:type="dxa"/>
             </w:tcMar>
+            <w:hideMark/>
           </w:tcPr>
           <w:p>
             <w:pPr>
@@ -11364,6 +11367,7 @@
               <w:bottom w:w="60" w:type="dxa"/>
               <w:right w:w="100" w:type="dxa"/>
             </w:tcMar>
+            <w:hideMark/>
           </w:tcPr>
           <w:p>
             <w:pPr>
@@ -11396,6 +11400,7 @@
               <w:bottom w:w="60" w:type="dxa"/>
               <w:right w:w="100" w:type="dxa"/>
             </w:tcMar>
+            <w:hideMark/>
           </w:tcPr>
           <w:p>
             <w:pPr>
@@ -11428,6 +11433,7 @@
               <w:bottom w:w="60" w:type="dxa"/>
               <w:right w:w="100" w:type="dxa"/>
             </w:tcMar>
+            <w:hideMark/>
           </w:tcPr>
           <w:p>
             <w:pPr>
@@ -11460,6 +11466,7 @@
               <w:bottom w:w="60" w:type="dxa"/>
               <w:right w:w="100" w:type="dxa"/>
             </w:tcMar>
+            <w:hideMark/>
           </w:tcPr>
           <w:p>
             <w:pPr>
@@ -11494,6 +11501,7 @@
               <w:bottom w:w="60" w:type="dxa"/>
               <w:right w:w="100" w:type="dxa"/>
             </w:tcMar>
+            <w:hideMark/>
           </w:tcPr>
           <w:p>
             <w:pPr>
@@ -11526,6 +11534,7 @@
               <w:bottom w:w="60" w:type="dxa"/>
               <w:right w:w="100" w:type="dxa"/>
             </w:tcMar>
+            <w:hideMark/>
           </w:tcPr>
           <w:p>
             <w:pPr>
@@ -11558,6 +11567,7 @@
               <w:bottom w:w="60" w:type="dxa"/>
               <w:right w:w="100" w:type="dxa"/>
             </w:tcMar>
+            <w:hideMark/>
           </w:tcPr>
           <w:p>
             <w:pPr>
@@ -11590,6 +11600,7 @@
               <w:bottom w:w="60" w:type="dxa"/>
               <w:right w:w="100" w:type="dxa"/>
             </w:tcMar>
+            <w:hideMark/>
           </w:tcPr>
           <w:p>
             <w:pPr>
@@ -11624,6 +11635,7 @@
               <w:bottom w:w="60" w:type="dxa"/>
               <w:right w:w="100" w:type="dxa"/>
             </w:tcMar>
+            <w:hideMark/>
           </w:tcPr>
           <w:p>
             <w:pPr>
@@ -11656,6 +11668,7 @@
               <w:bottom w:w="60" w:type="dxa"/>
               <w:right w:w="100" w:type="dxa"/>
             </w:tcMar>
+            <w:hideMark/>
           </w:tcPr>
           <w:p>
             <w:pPr>
@@ -11688,6 +11701,7 @@
               <w:bottom w:w="60" w:type="dxa"/>
               <w:right w:w="100" w:type="dxa"/>
             </w:tcMar>
+            <w:hideMark/>
           </w:tcPr>
           <w:p>
             <w:pPr>
@@ -11720,6 +11734,7 @@
               <w:bottom w:w="60" w:type="dxa"/>
               <w:right w:w="100" w:type="dxa"/>
             </w:tcMar>
+            <w:hideMark/>
           </w:tcPr>
           <w:p>
             <w:pPr>
@@ -11754,6 +11769,7 @@
               <w:bottom w:w="60" w:type="dxa"/>
               <w:right w:w="100" w:type="dxa"/>
             </w:tcMar>
+            <w:hideMark/>
           </w:tcPr>
           <w:p>
             <w:pPr>
@@ -11786,6 +11802,7 @@
               <w:bottom w:w="60" w:type="dxa"/>
               <w:right w:w="100" w:type="dxa"/>
             </w:tcMar>
+            <w:hideMark/>
           </w:tcPr>
           <w:p>
             <w:pPr>
@@ -11818,6 +11835,7 @@
               <w:bottom w:w="60" w:type="dxa"/>
               <w:right w:w="100" w:type="dxa"/>
             </w:tcMar>
+            <w:hideMark/>
           </w:tcPr>
           <w:p>
             <w:pPr>
@@ -11850,6 +11868,7 @@
               <w:bottom w:w="60" w:type="dxa"/>
               <w:right w:w="100" w:type="dxa"/>
             </w:tcMar>
+            <w:hideMark/>
           </w:tcPr>
           <w:p>
             <w:pPr>
@@ -12017,6 +12036,7 @@
               <w:bottom w:w="60" w:type="dxa"/>
               <w:right w:w="100" w:type="dxa"/>
             </w:tcMar>
+            <w:hideMark/>
           </w:tcPr>
           <w:p>
             <w:pPr>
@@ -12052,6 +12072,7 @@
               <w:bottom w:w="60" w:type="dxa"/>
               <w:right w:w="100" w:type="dxa"/>
             </w:tcMar>
+            <w:hideMark/>
           </w:tcPr>
           <w:p>
             <w:pPr>
@@ -12088,6 +12109,7 @@
               <w:bottom w:w="60" w:type="dxa"/>
               <w:right w:w="100" w:type="dxa"/>
             </w:tcMar>
+            <w:hideMark/>
           </w:tcPr>
           <w:p>
             <w:pPr>
@@ -12120,6 +12142,7 @@
               <w:bottom w:w="60" w:type="dxa"/>
               <w:right w:w="100" w:type="dxa"/>
             </w:tcMar>
+            <w:hideMark/>
           </w:tcPr>
           <w:p>
             <w:pPr>
@@ -12152,6 +12175,7 @@
               <w:bottom w:w="60" w:type="dxa"/>
               <w:right w:w="100" w:type="dxa"/>
             </w:tcMar>
+            <w:hideMark/>
           </w:tcPr>
           <w:p>
             <w:pPr>
@@ -12186,6 +12210,7 @@
               <w:bottom w:w="60" w:type="dxa"/>
               <w:right w:w="100" w:type="dxa"/>
             </w:tcMar>
+            <w:hideMark/>
           </w:tcPr>
           <w:p>
             <w:pPr>
@@ -12218,6 +12243,7 @@
               <w:bottom w:w="60" w:type="dxa"/>
               <w:right w:w="100" w:type="dxa"/>
             </w:tcMar>
+            <w:hideMark/>
           </w:tcPr>
           <w:p>
             <w:pPr>
@@ -12250,6 +12276,7 @@
               <w:bottom w:w="60" w:type="dxa"/>
               <w:right w:w="100" w:type="dxa"/>
             </w:tcMar>
+            <w:hideMark/>
           </w:tcPr>
           <w:p>
             <w:pPr>
@@ -12284,6 +12311,7 @@
               <w:bottom w:w="60" w:type="dxa"/>
               <w:right w:w="100" w:type="dxa"/>
             </w:tcMar>
+            <w:hideMark/>
           </w:tcPr>
           <w:p>
             <w:pPr>
@@ -12316,6 +12344,7 @@
               <w:bottom w:w="60" w:type="dxa"/>
               <w:right w:w="100" w:type="dxa"/>
             </w:tcMar>
+            <w:hideMark/>
           </w:tcPr>
           <w:p>
             <w:pPr>
@@ -12348,6 +12377,7 @@
               <w:bottom w:w="60" w:type="dxa"/>
               <w:right w:w="100" w:type="dxa"/>
             </w:tcMar>
+            <w:hideMark/>
           </w:tcPr>
           <w:p>
             <w:pPr>
@@ -12382,6 +12412,7 @@
               <w:bottom w:w="60" w:type="dxa"/>
               <w:right w:w="100" w:type="dxa"/>
             </w:tcMar>
+            <w:hideMark/>
           </w:tcPr>
           <w:p>
             <w:pPr>
@@ -12414,6 +12445,7 @@
               <w:bottom w:w="60" w:type="dxa"/>
               <w:right w:w="100" w:type="dxa"/>
             </w:tcMar>
+            <w:hideMark/>
           </w:tcPr>
           <w:p>
             <w:pPr>
@@ -12446,6 +12478,7 @@
               <w:bottom w:w="60" w:type="dxa"/>
               <w:right w:w="100" w:type="dxa"/>
             </w:tcMar>
+            <w:hideMark/>
           </w:tcPr>
           <w:p>
             <w:pPr>
@@ -12480,6 +12513,7 @@
               <w:bottom w:w="60" w:type="dxa"/>
               <w:right w:w="100" w:type="dxa"/>
             </w:tcMar>
+            <w:hideMark/>
           </w:tcPr>
           <w:p>
             <w:pPr>
@@ -12512,6 +12546,7 @@
               <w:bottom w:w="60" w:type="dxa"/>
               <w:right w:w="100" w:type="dxa"/>
             </w:tcMar>
+            <w:hideMark/>
           </w:tcPr>
           <w:p>
             <w:pPr>
@@ -12544,6 +12579,7 @@
               <w:bottom w:w="60" w:type="dxa"/>
               <w:right w:w="100" w:type="dxa"/>
             </w:tcMar>
+            <w:hideMark/>
           </w:tcPr>
           <w:p>
             <w:pPr>
@@ -12578,6 +12614,7 @@
               <w:bottom w:w="60" w:type="dxa"/>
               <w:right w:w="100" w:type="dxa"/>
             </w:tcMar>
+            <w:hideMark/>
           </w:tcPr>
           <w:p>
             <w:pPr>
@@ -12610,6 +12647,7 @@
               <w:bottom w:w="60" w:type="dxa"/>
               <w:right w:w="100" w:type="dxa"/>
             </w:tcMar>
+            <w:hideMark/>
           </w:tcPr>
           <w:p>
             <w:pPr>
@@ -12642,6 +12680,7 @@
               <w:bottom w:w="60" w:type="dxa"/>
               <w:right w:w="100" w:type="dxa"/>
             </w:tcMar>
+            <w:hideMark/>
           </w:tcPr>
           <w:p>
             <w:pPr>
@@ -12757,7 +12796,7 @@
         <w:pStyle w:val="ListParagraph"/>
         <w:numPr>
           <w:ilvl w:val="0"/>
-          <w:numId w:val="6"/>
+          <w:numId w:val="10"/>
         </w:numPr>
         <w:spacing w:after="60"/>
         <w:rPr>
@@ -12778,7 +12817,7 @@
         <w:pStyle w:val="ListParagraph"/>
         <w:numPr>
           <w:ilvl w:val="0"/>
-          <w:numId w:val="6"/>
+          <w:numId w:val="10"/>
         </w:numPr>
         <w:spacing w:after="60"/>
         <w:rPr>
@@ -12799,7 +12838,7 @@
         <w:pStyle w:val="ListParagraph"/>
         <w:numPr>
           <w:ilvl w:val="0"/>
-          <w:numId w:val="6"/>
+          <w:numId w:val="10"/>
         </w:numPr>
         <w:spacing w:after="60"/>
         <w:rPr>
@@ -12874,6 +12913,7 @@
               <w:bottom w:w="60" w:type="dxa"/>
               <w:right w:w="100" w:type="dxa"/>
             </w:tcMar>
+            <w:hideMark/>
           </w:tcPr>
           <w:p>
             <w:pPr>
@@ -12909,6 +12949,7 @@
               <w:bottom w:w="60" w:type="dxa"/>
               <w:right w:w="100" w:type="dxa"/>
             </w:tcMar>
+            <w:hideMark/>
           </w:tcPr>
           <w:p>
             <w:pPr>
@@ -12944,6 +12985,7 @@
               <w:bottom w:w="60" w:type="dxa"/>
               <w:right w:w="100" w:type="dxa"/>
             </w:tcMar>
+            <w:hideMark/>
           </w:tcPr>
           <w:p>
             <w:pPr>
@@ -12979,6 +13021,7 @@
               <w:bottom w:w="60" w:type="dxa"/>
               <w:right w:w="100" w:type="dxa"/>
             </w:tcMar>
+            <w:hideMark/>
           </w:tcPr>
           <w:p>
             <w:pPr>
@@ -13014,6 +13057,7 @@
               <w:bottom w:w="60" w:type="dxa"/>
               <w:right w:w="100" w:type="dxa"/>
             </w:tcMar>
+            <w:hideMark/>
           </w:tcPr>
           <w:p>
             <w:pPr>
@@ -13050,6 +13094,7 @@
               <w:bottom w:w="60" w:type="dxa"/>
               <w:right w:w="100" w:type="dxa"/>
             </w:tcMar>
+            <w:hideMark/>
           </w:tcPr>
           <w:p>
             <w:pPr>
@@ -13082,6 +13127,7 @@
               <w:bottom w:w="60" w:type="dxa"/>
               <w:right w:w="100" w:type="dxa"/>
             </w:tcMar>
+            <w:hideMark/>
           </w:tcPr>
           <w:p>
             <w:pPr>
@@ -13114,6 +13160,7 @@
               <w:bottom w:w="60" w:type="dxa"/>
               <w:right w:w="100" w:type="dxa"/>
             </w:tcMar>
+            <w:hideMark/>
           </w:tcPr>
           <w:p>
             <w:pPr>
@@ -13146,6 +13193,7 @@
               <w:bottom w:w="60" w:type="dxa"/>
               <w:right w:w="100" w:type="dxa"/>
             </w:tcMar>
+            <w:hideMark/>
           </w:tcPr>
           <w:p>
             <w:pPr>
@@ -13178,6 +13226,7 @@
               <w:bottom w:w="60" w:type="dxa"/>
               <w:right w:w="100" w:type="dxa"/>
             </w:tcMar>
+            <w:hideMark/>
           </w:tcPr>
           <w:p>
             <w:pPr>
@@ -13212,6 +13261,7 @@
               <w:bottom w:w="60" w:type="dxa"/>
               <w:right w:w="100" w:type="dxa"/>
             </w:tcMar>
+            <w:hideMark/>
           </w:tcPr>
           <w:p>
             <w:pPr>
@@ -13244,6 +13294,7 @@
               <w:bottom w:w="60" w:type="dxa"/>
               <w:right w:w="100" w:type="dxa"/>
             </w:tcMar>
+            <w:hideMark/>
           </w:tcPr>
           <w:p>
             <w:pPr>
@@ -13276,6 +13327,7 @@
               <w:bottom w:w="60" w:type="dxa"/>
               <w:right w:w="100" w:type="dxa"/>
             </w:tcMar>
+            <w:hideMark/>
           </w:tcPr>
           <w:p>
             <w:pPr>
@@ -13308,6 +13360,7 @@
               <w:bottom w:w="60" w:type="dxa"/>
               <w:right w:w="100" w:type="dxa"/>
             </w:tcMar>
+            <w:hideMark/>
           </w:tcPr>
           <w:p>
             <w:pPr>
@@ -13340,6 +13393,7 @@
               <w:bottom w:w="60" w:type="dxa"/>
               <w:right w:w="100" w:type="dxa"/>
             </w:tcMar>
+            <w:hideMark/>
           </w:tcPr>
           <w:p>
             <w:pPr>
@@ -13374,6 +13428,7 @@
               <w:bottom w:w="60" w:type="dxa"/>
               <w:right w:w="100" w:type="dxa"/>
             </w:tcMar>
+            <w:hideMark/>
           </w:tcPr>
           <w:p>
             <w:pPr>
@@ -13406,6 +13461,7 @@
               <w:bottom w:w="60" w:type="dxa"/>
               <w:right w:w="100" w:type="dxa"/>
             </w:tcMar>
+            <w:hideMark/>
           </w:tcPr>
           <w:p>
             <w:pPr>
@@ -13438,6 +13494,7 @@
               <w:bottom w:w="60" w:type="dxa"/>
               <w:right w:w="100" w:type="dxa"/>
             </w:tcMar>
+            <w:hideMark/>
           </w:tcPr>
           <w:p>
             <w:pPr>
@@ -13470,6 +13527,7 @@
               <w:bottom w:w="60" w:type="dxa"/>
               <w:right w:w="100" w:type="dxa"/>
             </w:tcMar>
+            <w:hideMark/>
           </w:tcPr>
           <w:p>
             <w:pPr>
@@ -13502,6 +13560,7 @@
               <w:bottom w:w="60" w:type="dxa"/>
               <w:right w:w="100" w:type="dxa"/>
             </w:tcMar>
+            <w:hideMark/>
           </w:tcPr>
           <w:p>
             <w:pPr>
@@ -13535,7 +13594,7 @@
         <w:pStyle w:val="ListParagraph"/>
         <w:numPr>
           <w:ilvl w:val="0"/>
-          <w:numId w:val="6"/>
+          <w:numId w:val="10"/>
         </w:numPr>
         <w:spacing w:after="60"/>
         <w:rPr>
@@ -13597,7 +13656,7 @@
         <w:pStyle w:val="ListParagraph"/>
         <w:numPr>
           <w:ilvl w:val="0"/>
-          <w:numId w:val="6"/>
+          <w:numId w:val="10"/>
         </w:numPr>
         <w:spacing w:after="60"/>
         <w:rPr>
@@ -13661,7 +13720,7 @@
         <w:pStyle w:val="ListParagraph"/>
         <w:numPr>
           <w:ilvl w:val="0"/>
-          <w:numId w:val="6"/>
+          <w:numId w:val="10"/>
         </w:numPr>
         <w:spacing w:after="60"/>
         <w:rPr>
@@ -13698,7 +13757,7 @@
         <w:pStyle w:val="ListParagraph"/>
         <w:numPr>
           <w:ilvl w:val="0"/>
-          <w:numId w:val="6"/>
+          <w:numId w:val="10"/>
         </w:numPr>
         <w:spacing w:after="60"/>
         <w:rPr>
@@ -13711,22 +13770,7 @@
           <w:sz w:val="24"/>
           <w:szCs w:val="24"/>
         </w:rPr>
-        <w:t xml:space="preserve">Mô hình Regression là mô hình tuyến tính nên với đơn giá và số lượng rất thấp (ví dụ băng vệ sinh, mua 1 sản phẩm) có thể dự đoán ra số âm. Ứng dụng đã xử lý bằng </w:t>
-      </w:r>
-      <w:r>
-        <w:rPr>
-          <w:rFonts w:eastAsia="Consolas"/>
-          <w:sz w:val="24"/>
-          <w:szCs w:val="24"/>
-        </w:rPr>
-        <w:t>max(0, …)</w:t>
-      </w:r>
-      <w:r>
-        <w:rPr>
-          <w:sz w:val="24"/>
-          <w:szCs w:val="24"/>
-        </w:rPr>
-        <w:t xml:space="preserve"> để đưa về 0.</w:t>
+        <w:t>Mô hình Regression chỉ dựa trên nhóm sản phẩm, thương hiệu và điểm đánh giá nên có sai số khá lớn (RMSE khoảng 48.444 VND), chỉ dùng làm giá tham khảo. Ở tập test mô hình không dự đoán ra giá âm, nhưng ứng dụng vẫn dùng max(0, ...) để phòng trường hợp ngoại lệ.</w:t>
       </w:r>
     </w:p>
     <w:p>
@@ -13734,7 +13778,7 @@
         <w:pStyle w:val="ListParagraph"/>
         <w:numPr>
           <w:ilvl w:val="0"/>
-          <w:numId w:val="6"/>
+          <w:numId w:val="10"/>
         </w:numPr>
         <w:spacing w:after="60"/>
         <w:rPr>
@@ -13747,7 +13791,7 @@
           <w:sz w:val="24"/>
           <w:szCs w:val="24"/>
         </w:rPr>
-        <w:t>Mô hình phân loại không dùng đơn giá làm đầu vào, mà dùng số lượng và nhóm sản phẩm.</w:t>
+        <w:t>Mô hình phân loại không dùng đơn giá làm đầu vào, mà dùng số lượng và nhóm sản phẩm. Hai mô hình trên giao diện (giá sản phẩm và loại đơn) độc lập với nhau.</w:t>
       </w:r>
     </w:p>
     <w:p>
@@ -13755,7 +13799,7 @@
         <w:pStyle w:val="ListParagraph"/>
         <w:numPr>
           <w:ilvl w:val="0"/>
-          <w:numId w:val="6"/>
+          <w:numId w:val="10"/>
         </w:numPr>
         <w:spacing w:after="60"/>
         <w:rPr>
@@ -13778,6 +13822,9 @@
           <w:ilvl w:val="0"/>
           <w:numId w:val="0"/>
         </w:numPr>
+        <w:tabs>
+          <w:tab w:val="left" w:pos="720"/>
+        </w:tabs>
         <w:spacing w:after="120" w:line="312" w:lineRule="auto"/>
         <w:ind w:left="360" w:hanging="360"/>
         <w:rPr>
@@ -13797,6 +13844,7 @@
         </w:rPr>
       </w:pPr>
     </w:p>
+    <w:p/>
     <w:sectPr>
       <w:pgSz w:w="11906" w:h="16838"/>
       <w:pgMar w:top="1440" w:right="1440" w:bottom="1440" w:left="1440" w:header="708" w:footer="708" w:gutter="0"/>
@@ -14129,6 +14177,29 @@
       <w:startOverride w:val="1"/>
     </w:lvlOverride>
   </w:num>
+  <w:num w:numId="7">
+    <w:abstractNumId w:val="1"/>
+  </w:num>
+  <w:num w:numId="8">
+    <w:abstractNumId w:val="4"/>
+  </w:num>
+  <w:num w:numId="9">
+    <w:abstractNumId w:val="5"/>
+    <w:lvlOverride w:ilvl="0">
+      <w:startOverride w:val="1"/>
+    </w:lvlOverride>
+    <w:lvlOverride w:ilvl="1"/>
+    <w:lvlOverride w:ilvl="2"/>
+    <w:lvlOverride w:ilvl="3"/>
+    <w:lvlOverride w:ilvl="4"/>
+    <w:lvlOverride w:ilvl="5"/>
+    <w:lvlOverride w:ilvl="6"/>
+    <w:lvlOverride w:ilvl="7"/>
+    <w:lvlOverride w:ilvl="8"/>
+  </w:num>
+  <w:num w:numId="10">
+    <w:abstractNumId w:val="2"/>
+  </w:num>
 </w:numbering>
 </file>
 
@@ -14147,9 +14218,9 @@
   </w:docDefaults>
   <w:latentStyles w:defLockedState="0" w:defUIPriority="99" w:defSemiHidden="1" w:defUnhideWhenUsed="1" w:defQFormat="0" w:count="267">
     <w:lsdException w:name="Normal" w:semiHidden="0" w:uiPriority="0" w:unhideWhenUsed="0" w:qFormat="1"/>
-    <w:lsdException w:name="heading 1" w:semiHidden="0" w:uiPriority="9" w:unhideWhenUsed="0" w:qFormat="1"/>
-    <w:lsdException w:name="heading 2" w:uiPriority="9" w:qFormat="1"/>
-    <w:lsdException w:name="heading 3" w:uiPriority="9" w:qFormat="1"/>
+    <w:lsdException w:name="heading 1" w:semiHidden="0" w:uiPriority="0" w:unhideWhenUsed="0" w:qFormat="1"/>
+    <w:lsdException w:name="heading 2" w:uiPriority="0" w:qFormat="1"/>
+    <w:lsdException w:name="heading 3" w:uiPriority="0" w:qFormat="1"/>
     <w:lsdException w:name="heading 4" w:uiPriority="9" w:qFormat="1"/>
     <w:lsdException w:name="heading 5" w:uiPriority="9" w:qFormat="1"/>
     <w:lsdException w:name="heading 6" w:uiPriority="9" w:qFormat="1"/>
@@ -14290,6 +14361,7 @@
   </w:style>
   <w:style w:type="paragraph" w:styleId="Heading1">
     <w:name w:val="heading 1"/>
+    <w:link w:val="Heading1Char"/>
     <w:qFormat/>
     <w:rsid w:val="00B10410"/>
     <w:pPr>
@@ -14307,6 +14379,7 @@
   </w:style>
   <w:style w:type="paragraph" w:styleId="Heading2">
     <w:name w:val="heading 2"/>
+    <w:link w:val="Heading2Char"/>
     <w:qFormat/>
     <w:pPr>
       <w:outlineLvl w:val="1"/>
@@ -14317,6 +14390,7 @@
   </w:style>
   <w:style w:type="paragraph" w:styleId="Heading3">
     <w:name w:val="heading 3"/>
+    <w:link w:val="Heading3Char"/>
     <w:qFormat/>
     <w:pPr>
       <w:outlineLvl w:val="2"/>
@@ -14566,6 +14640,51 @@
       <w:szCs w:val="22"/>
     </w:rPr>
   </w:style>
+  <w:style w:type="character" w:customStyle="1" w:styleId="Heading1Char">
+    <w:name w:val="Heading 1 Char"/>
+    <w:basedOn w:val="DefaultParagraphFont"/>
+    <w:link w:val="Heading1"/>
+    <w:rsid w:val="00BD702E"/>
+    <w:rPr>
+      <w:b/>
+      <w:bCs/>
+      <w:color w:val="000000"/>
+      <w:sz w:val="24"/>
+      <w:szCs w:val="24"/>
+    </w:rPr>
+  </w:style>
+  <w:style w:type="character" w:customStyle="1" w:styleId="Heading2Char">
+    <w:name w:val="Heading 2 Char"/>
+    <w:basedOn w:val="DefaultParagraphFont"/>
+    <w:link w:val="Heading2"/>
+    <w:rsid w:val="00BD702E"/>
+    <w:rPr>
+      <w:color w:val="2E74B5"/>
+    </w:rPr>
+  </w:style>
+  <w:style w:type="character" w:customStyle="1" w:styleId="Heading3Char">
+    <w:name w:val="Heading 3 Char"/>
+    <w:basedOn w:val="DefaultParagraphFont"/>
+    <w:link w:val="Heading3"/>
+    <w:rsid w:val="00BD702E"/>
+    <w:rPr>
+      <w:color w:val="1F4D78"/>
+      <w:sz w:val="24"/>
+      <w:szCs w:val="24"/>
+    </w:rPr>
+  </w:style>
+  <w:style w:type="character" w:styleId="FollowedHyperlink">
+    <w:name w:val="FollowedHyperlink"/>
+    <w:basedOn w:val="DefaultParagraphFont"/>
+    <w:uiPriority w:val="99"/>
+    <w:semiHidden/>
+    <w:unhideWhenUsed/>
+    <w:rsid w:val="00BD702E"/>
+    <w:rPr>
+      <w:color w:val="800080" w:themeColor="followedHyperlink"/>
+      <w:u w:val="single"/>
+    </w:rPr>
+  </w:style>
 </w:styles>
 </file>
 
@@ -14584,9 +14703,9 @@
   </w:docDefaults>
   <w:latentStyles w:defLockedState="0" w:defUIPriority="99" w:defSemiHidden="1" w:defUnhideWhenUsed="1" w:defQFormat="0" w:count="267">
     <w:lsdException w:name="Normal" w:semiHidden="0" w:uiPriority="0" w:unhideWhenUsed="0" w:qFormat="1"/>
-    <w:lsdException w:name="heading 1" w:semiHidden="0" w:uiPriority="9" w:unhideWhenUsed="0" w:qFormat="1"/>
-    <w:lsdException w:name="heading 2" w:uiPriority="9" w:qFormat="1"/>
-    <w:lsdException w:name="heading 3" w:uiPriority="9" w:qFormat="1"/>
+    <w:lsdException w:name="heading 1" w:semiHidden="0" w:uiPriority="0" w:unhideWhenUsed="0" w:qFormat="1"/>
+    <w:lsdException w:name="heading 2" w:uiPriority="0" w:qFormat="1"/>
+    <w:lsdException w:name="heading 3" w:uiPriority="0" w:qFormat="1"/>
     <w:lsdException w:name="heading 4" w:uiPriority="9" w:qFormat="1"/>
     <w:lsdException w:name="heading 5" w:uiPriority="9" w:qFormat="1"/>
     <w:lsdException w:name="heading 6" w:uiPriority="9" w:qFormat="1"/>
@@ -14727,6 +14846,7 @@
   </w:style>
   <w:style w:type="paragraph" w:styleId="Heading1">
     <w:name w:val="heading 1"/>
+    <w:link w:val="Heading1Char"/>
     <w:qFormat/>
     <w:rsid w:val="00B10410"/>
     <w:pPr>
@@ -14744,6 +14864,7 @@
   </w:style>
   <w:style w:type="paragraph" w:styleId="Heading2">
     <w:name w:val="heading 2"/>
+    <w:link w:val="Heading2Char"/>
     <w:qFormat/>
     <w:pPr>
       <w:outlineLvl w:val="1"/>
@@ -14754,6 +14875,7 @@
   </w:style>
   <w:style w:type="paragraph" w:styleId="Heading3">
     <w:name w:val="heading 3"/>
+    <w:link w:val="Heading3Char"/>
     <w:qFormat/>
     <w:pPr>
       <w:outlineLvl w:val="2"/>
@@ -15001,6 +15123,51 @@
       <w:rFonts w:cstheme="minorBidi"/>
       <w:color w:val="000000"/>
       <w:szCs w:val="22"/>
+    </w:rPr>
+  </w:style>
+  <w:style w:type="character" w:customStyle="1" w:styleId="Heading1Char">
+    <w:name w:val="Heading 1 Char"/>
+    <w:basedOn w:val="DefaultParagraphFont"/>
+    <w:link w:val="Heading1"/>
+    <w:rsid w:val="00BD702E"/>
+    <w:rPr>
+      <w:b/>
+      <w:bCs/>
+      <w:color w:val="000000"/>
+      <w:sz w:val="24"/>
+      <w:szCs w:val="24"/>
+    </w:rPr>
+  </w:style>
+  <w:style w:type="character" w:customStyle="1" w:styleId="Heading2Char">
+    <w:name w:val="Heading 2 Char"/>
+    <w:basedOn w:val="DefaultParagraphFont"/>
+    <w:link w:val="Heading2"/>
+    <w:rsid w:val="00BD702E"/>
+    <w:rPr>
+      <w:color w:val="2E74B5"/>
+    </w:rPr>
+  </w:style>
+  <w:style w:type="character" w:customStyle="1" w:styleId="Heading3Char">
+    <w:name w:val="Heading 3 Char"/>
+    <w:basedOn w:val="DefaultParagraphFont"/>
+    <w:link w:val="Heading3"/>
+    <w:rsid w:val="00BD702E"/>
+    <w:rPr>
+      <w:color w:val="1F4D78"/>
+      <w:sz w:val="24"/>
+      <w:szCs w:val="24"/>
+    </w:rPr>
+  </w:style>
+  <w:style w:type="character" w:styleId="FollowedHyperlink">
+    <w:name w:val="FollowedHyperlink"/>
+    <w:basedOn w:val="DefaultParagraphFont"/>
+    <w:uiPriority w:val="99"/>
+    <w:semiHidden/>
+    <w:unhideWhenUsed/>
+    <w:rsid w:val="00BD702E"/>
+    <w:rPr>
+      <w:color w:val="800080" w:themeColor="followedHyperlink"/>
+      <w:u w:val="single"/>
     </w:rPr>
   </w:style>
 </w:styles>

</xml_diff>